<commit_message>
Update prompt history document and add PDF export
- Update 仕様駆動開発 プロンプト履歴.docx with latest edits
- Add PDF export of prompt history document
- Remove Office temporary lock file (~$) from repository

Co-Authored-By: Claude Opus 4.6 (1M context) <noreply@anthropic.com>
</commit_message>
<xml_diff>
--- a/Docs/仕様駆動開発 プロンプト履歴.docx
+++ b/Docs/仕様駆動開発 プロンプト履歴.docx
@@ -127,6 +127,13 @@
       </w:r>
       <w:r>
         <w:rPr>
+          <w:rStyle w:val="ae"/>
+          <w:lang w:eastAsia="ja-JP"/>
+        </w:rPr>
+        <w:footnoteReference w:id="1"/>
+      </w:r>
+      <w:r>
+        <w:rPr>
           <w:rFonts w:hint="eastAsia"/>
           <w:lang w:eastAsia="ja-JP"/>
         </w:rPr>
@@ -144,7 +151,28 @@
           <w:rFonts w:hint="eastAsia"/>
           <w:lang w:eastAsia="ja-JP"/>
         </w:rPr>
-        <w:t>補佐として、私と上級エンジニアとのやり取りに助言し、プロジェクトを推進することです。また、当社は文書として経緯を記録することをルールにしています。上級エンジニアへの指示、レビュー等は、</w:t>
+        <w:t>補佐として、私と上級エンジニア</w:t>
+      </w:r>
+      <w:r>
+        <w:rPr>
+          <w:rStyle w:val="ae"/>
+          <w:lang w:eastAsia="ja-JP"/>
+        </w:rPr>
+        <w:footnoteReference w:id="2"/>
+      </w:r>
+      <w:r>
+        <w:rPr>
+          <w:rFonts w:hint="eastAsia"/>
+          <w:lang w:eastAsia="ja-JP"/>
+        </w:rPr>
+        <w:t>とのやり取りに助言し、プロジェクトを推進することです。また、</w:t>
+      </w:r>
+      <w:r>
+        <w:rPr>
+          <w:rFonts w:hint="eastAsia"/>
+          <w:lang w:eastAsia="ja-JP"/>
+        </w:rPr>
+        <w:t>当社は文書として経緯を記録することをルールにしています。上級エンジニアへの指示、レビュー等は、</w:t>
       </w:r>
       <w:r>
         <w:rPr>
@@ -158,7 +186,21 @@
           <w:rFonts w:hint="eastAsia"/>
           <w:lang w:eastAsia="ja-JP"/>
         </w:rPr>
-        <w:t>記法で記述した</w:t>
+        <w:t>記法</w:t>
+      </w:r>
+      <w:r>
+        <w:rPr>
+          <w:rStyle w:val="ae"/>
+          <w:lang w:eastAsia="ja-JP"/>
+        </w:rPr>
+        <w:footnoteReference w:id="3"/>
+      </w:r>
+      <w:r>
+        <w:rPr>
+          <w:rFonts w:hint="eastAsia"/>
+          <w:lang w:eastAsia="ja-JP"/>
+        </w:rPr>
+        <w:t>で記述した</w:t>
       </w:r>
       <w:r>
         <w:rPr>
@@ -222,7 +264,7 @@
           <w:rFonts w:hint="eastAsia"/>
           <w:lang w:eastAsia="ja-JP"/>
         </w:rPr>
-        <w:t>(</w:t>
+        <w:t>（</w:t>
       </w:r>
       <w:r>
         <w:rPr>
@@ -264,7 +306,7 @@
           <w:rFonts w:hint="eastAsia"/>
           <w:lang w:eastAsia="ja-JP"/>
         </w:rPr>
-        <w:t>)</w:t>
+        <w:t>）</w:t>
       </w:r>
       <w:r>
         <w:rPr>
@@ -294,7 +336,7 @@
           <w:numId w:val="2"/>
         </w:numPr>
       </w:pPr>
-      <w:hyperlink r:id="rId5">
+      <w:hyperlink r:id="rId8">
         <w:r>
           <w:rPr>
             <w:rStyle w:val="af"/>
@@ -461,6 +503,7 @@
           <w:rFonts w:hint="eastAsia"/>
           <w:lang w:eastAsia="ja-JP"/>
         </w:rPr>
+        <w:lastRenderedPageBreak/>
         <w:t>形式ファイル（</w:t>
       </w:r>
       <w:r>
@@ -504,7 +547,6 @@
           <w:rFonts w:hint="eastAsia"/>
           <w:lang w:eastAsia="ja-JP"/>
         </w:rPr>
-        <w:lastRenderedPageBreak/>
         <w:t>さて、</w:t>
       </w:r>
       <w:r>
@@ -577,7 +619,7 @@
           <w:lang w:eastAsia="ja-JP"/>
         </w:rPr>
       </w:pPr>
-      <w:hyperlink r:id="rId6">
+      <w:hyperlink r:id="rId9">
         <w:r>
           <w:rPr>
             <w:rStyle w:val="af"/>
@@ -626,7 +668,7 @@
           <w:numId w:val="3"/>
         </w:numPr>
       </w:pPr>
-      <w:hyperlink r:id="rId7">
+      <w:hyperlink r:id="rId10">
         <w:r>
           <w:rPr>
             <w:rStyle w:val="af"/>
@@ -711,12 +753,24 @@
       <w:r>
         <w:t xml:space="preserve"> </w:t>
       </w:r>
-      <w:hyperlink r:id="rId8">
+      <w:hyperlink r:id="rId11">
         <w:r>
           <w:rPr>
             <w:rStyle w:val="af"/>
           </w:rPr>
-          <w:t>002_Engineer_Review_of_Project_Planning.md</w:t>
+          <w:t>002_Engineer_Review_of_Project_Pl</w:t>
+        </w:r>
+        <w:r>
+          <w:rPr>
+            <w:rStyle w:val="af"/>
+          </w:rPr>
+          <w:t>a</w:t>
+        </w:r>
+        <w:r>
+          <w:rPr>
+            <w:rStyle w:val="af"/>
+          </w:rPr>
+          <w:t>nning.md</w:t>
         </w:r>
       </w:hyperlink>
     </w:p>
@@ -738,7 +792,21 @@
           <w:rFonts w:hint="eastAsia"/>
           <w:lang w:eastAsia="ja-JP"/>
         </w:rPr>
-        <w:t>以下は、今回のプロジェクトの目的と概要です。上級エンジニアには、構想段階の懸念事項があれば指摘してほしいと伝えてください。ただし、技術スタックは次の仕様フェイズで検討する、と伝えたいです。</w:t>
+        <w:t>以下は、今回のプロジェクトの目的と概要です。上級エンジニアには、構想段階の懸念事項があれば指摘してほしいと伝えてください。ただし、技術スタック</w:t>
+      </w:r>
+      <w:r>
+        <w:rPr>
+          <w:rStyle w:val="ae"/>
+          <w:lang w:eastAsia="ja-JP"/>
+        </w:rPr>
+        <w:footnoteReference w:id="4"/>
+      </w:r>
+      <w:r>
+        <w:rPr>
+          <w:rFonts w:hint="eastAsia"/>
+          <w:lang w:eastAsia="ja-JP"/>
+        </w:rPr>
+        <w:t>は次の仕様フェイズで検討する、と伝えたいです。</w:t>
       </w:r>
     </w:p>
     <w:p>
@@ -921,21 +989,24 @@
     <w:p>
       <w:pPr>
         <w:pStyle w:val="FirstParagraph"/>
-      </w:pPr>
-      <w:r>
-        <w:rPr>
-          <w:rFonts w:hint="eastAsia"/>
-          <w:lang w:eastAsia="ja-JP"/>
-        </w:rPr>
+        <w:rPr>
+          <w:lang w:eastAsia="ja-JP"/>
+        </w:rPr>
+      </w:pPr>
+      <w:r>
+        <w:rPr>
+          <w:rFonts w:hint="eastAsia"/>
+          <w:lang w:eastAsia="ja-JP"/>
+        </w:rPr>
+        <w:lastRenderedPageBreak/>
         <w:t>電話応対履歴のサンプルは以下にある、と伝えましょう。</w:t>
       </w:r>
-      <w:r>
-        <w:rPr>
-          <w:lang w:eastAsia="ja-JP"/>
-        </w:rPr>
-        <w:t xml:space="preserve"> </w:t>
-      </w:r>
-      <w:hyperlink r:id="rId9">
+    </w:p>
+    <w:p>
+      <w:pPr>
+        <w:pStyle w:val="FirstParagraph"/>
+      </w:pPr>
+      <w:hyperlink r:id="rId12">
         <w:r>
           <w:rPr>
             <w:rStyle w:val="af"/>
@@ -1022,7 +1093,6 @@
           <w:rFonts w:hint="eastAsia"/>
           <w:lang w:eastAsia="ja-JP"/>
         </w:rPr>
-        <w:lastRenderedPageBreak/>
         <w:t>フェーズ間のフィードバックループ</w:t>
       </w:r>
       <w:r>
@@ -1163,7 +1233,7 @@
           <w:numId w:val="6"/>
         </w:numPr>
       </w:pPr>
-      <w:hyperlink r:id="rId10">
+      <w:hyperlink r:id="rId13">
         <w:r>
           <w:rPr>
             <w:rStyle w:val="af"/>
@@ -1254,7 +1324,7 @@
         </w:rPr>
         <w:t xml:space="preserve"> </w:t>
       </w:r>
-      <w:hyperlink r:id="rId11">
+      <w:hyperlink r:id="rId14">
         <w:r>
           <w:rPr>
             <w:rStyle w:val="af"/>
@@ -1312,7 +1382,7 @@
           <w:numId w:val="7"/>
         </w:numPr>
       </w:pPr>
-      <w:hyperlink r:id="rId12">
+      <w:hyperlink r:id="rId15">
         <w:r>
           <w:rPr>
             <w:rStyle w:val="af"/>
@@ -1410,7 +1480,7 @@
         </w:rPr>
         <w:t xml:space="preserve"> </w:t>
       </w:r>
-      <w:hyperlink r:id="rId13">
+      <w:hyperlink r:id="rId16">
         <w:r>
           <w:rPr>
             <w:rStyle w:val="af"/>
@@ -1447,6 +1517,7 @@
           <w:rFonts w:hint="eastAsia"/>
           <w:lang w:eastAsia="ja-JP"/>
         </w:rPr>
+        <w:lastRenderedPageBreak/>
         <w:t>デモとしての伝達力にコメントがついています。この点については、</w:t>
       </w:r>
       <w:r>
@@ -1501,7 +1572,6 @@
         <w:rPr>
           <w:rFonts w:hint="eastAsia"/>
         </w:rPr>
-        <w:lastRenderedPageBreak/>
         <w:t>技術スタック：</w:t>
       </w:r>
     </w:p>
@@ -1525,6 +1595,13 @@
       </w:r>
       <w:r>
         <w:rPr>
+          <w:rStyle w:val="ae"/>
+          <w:lang w:eastAsia="ja-JP"/>
+        </w:rPr>
+        <w:footnoteReference w:id="5"/>
+      </w:r>
+      <w:r>
+        <w:rPr>
           <w:rFonts w:hint="eastAsia"/>
           <w:lang w:eastAsia="ja-JP"/>
         </w:rPr>
@@ -1564,6 +1641,13 @@
       </w:r>
       <w:r>
         <w:rPr>
+          <w:rStyle w:val="ae"/>
+          <w:lang w:eastAsia="ja-JP"/>
+        </w:rPr>
+        <w:footnoteReference w:id="6"/>
+      </w:r>
+      <w:r>
+        <w:rPr>
           <w:lang w:eastAsia="ja-JP"/>
         </w:rPr>
         <w:t>は、</w:t>
@@ -1583,6 +1667,13 @@
       </w:r>
       <w:r>
         <w:rPr>
+          <w:rStyle w:val="ae"/>
+          <w:lang w:eastAsia="ja-JP"/>
+        </w:rPr>
+        <w:footnoteReference w:id="7"/>
+      </w:r>
+      <w:r>
+        <w:rPr>
           <w:rFonts w:hint="eastAsia"/>
           <w:lang w:eastAsia="ja-JP"/>
         </w:rPr>
@@ -1607,6 +1698,13 @@
           <w:lang w:eastAsia="ja-JP"/>
         </w:rPr>
         <w:t>Accelerate</w:t>
+      </w:r>
+      <w:r>
+        <w:rPr>
+          <w:rStyle w:val="ae"/>
+          <w:lang w:eastAsia="ja-JP"/>
+        </w:rPr>
+        <w:footnoteReference w:id="8"/>
       </w:r>
       <w:r>
         <w:rPr>
@@ -1692,6 +1790,13 @@
       </w:r>
       <w:r>
         <w:rPr>
+          <w:rStyle w:val="ae"/>
+          <w:lang w:eastAsia="ja-JP"/>
+        </w:rPr>
+        <w:footnoteReference w:id="9"/>
+      </w:r>
+      <w:r>
+        <w:rPr>
           <w:rFonts w:hint="eastAsia"/>
           <w:lang w:eastAsia="ja-JP"/>
         </w:rPr>
@@ -1736,6 +1841,13 @@
       </w:r>
       <w:r>
         <w:rPr>
+          <w:rStyle w:val="ae"/>
+          <w:lang w:eastAsia="ja-JP"/>
+        </w:rPr>
+        <w:footnoteReference w:id="10"/>
+      </w:r>
+      <w:r>
+        <w:rPr>
           <w:rFonts w:hint="eastAsia"/>
           <w:lang w:eastAsia="ja-JP"/>
         </w:rPr>
@@ -1776,6 +1888,13 @@
       </w:r>
       <w:r>
         <w:rPr>
+          <w:rStyle w:val="ae"/>
+          <w:lang w:eastAsia="ja-JP"/>
+        </w:rPr>
+        <w:footnoteReference w:id="11"/>
+      </w:r>
+      <w:r>
+        <w:rPr>
           <w:rFonts w:hint="eastAsia"/>
           <w:lang w:eastAsia="ja-JP"/>
         </w:rPr>
@@ -1853,6 +1972,7 @@
         <w:rPr>
           <w:lang w:eastAsia="ja-JP"/>
         </w:rPr>
+        <w:lastRenderedPageBreak/>
         <w:t xml:space="preserve">macOS </w:t>
       </w:r>
       <w:r>
@@ -1888,6 +2008,13 @@
           <w:lang w:eastAsia="ja-JP"/>
         </w:rPr>
         <w:t>Charts</w:t>
+      </w:r>
+      <w:r>
+        <w:rPr>
+          <w:rStyle w:val="ae"/>
+          <w:lang w:eastAsia="ja-JP"/>
+        </w:rPr>
+        <w:footnoteReference w:id="12"/>
       </w:r>
       <w:r>
         <w:rPr>
@@ -1951,7 +2078,7 @@
       <w:r>
         <w:t xml:space="preserve"> </w:t>
       </w:r>
-      <w:hyperlink r:id="rId14">
+      <w:hyperlink r:id="rId17">
         <w:r>
           <w:rPr>
             <w:rStyle w:val="af"/>
@@ -2159,7 +2286,35 @@
           <w:rFonts w:hint="eastAsia"/>
           <w:lang w:eastAsia="ja-JP"/>
         </w:rPr>
-        <w:t>「分析」メニューアイテムがあり、選択すると分析ダイアログが登場する。「埋め込み」タブでは、メインウィンドウに表示中のデータセットの列リストから埋め込み対象を選び、設定画面で登録した埋め込みモデルで埋め込みを算出できる。「クラスタリング」タブでは、算出済みの埋め込みのリストがあり、選択した方法でクラスタリングできる。クラスタリングは、</w:t>
+        <w:t>「分析」メニューアイテムがあり、選択すると分析ダイアログが登場する。「埋め込み」タブでは、メインウィンドウに表示中のデータセットの列リストから埋め込み対象を選び、設定画面で登録した埋め込みモデルで埋め込みを算出できる。「クラスタリング</w:t>
+      </w:r>
+      <w:r>
+        <w:rPr>
+          <w:rStyle w:val="ae"/>
+          <w:lang w:eastAsia="ja-JP"/>
+        </w:rPr>
+        <w:footnoteReference w:id="13"/>
+      </w:r>
+      <w:r>
+        <w:rPr>
+          <w:rFonts w:hint="eastAsia"/>
+          <w:lang w:eastAsia="ja-JP"/>
+        </w:rPr>
+        <w:t>」タブでは、算出済みの埋め込み</w:t>
+      </w:r>
+      <w:r>
+        <w:rPr>
+          <w:rStyle w:val="ae"/>
+          <w:lang w:eastAsia="ja-JP"/>
+        </w:rPr>
+        <w:footnoteReference w:id="14"/>
+      </w:r>
+      <w:r>
+        <w:rPr>
+          <w:rFonts w:hint="eastAsia"/>
+          <w:lang w:eastAsia="ja-JP"/>
+        </w:rPr>
+        <w:t>のリストがあり、選択した方法でクラスタリングできる。クラスタリングは、</w:t>
       </w:r>
       <w:r>
         <w:rPr>
@@ -2170,6 +2325,13 @@
       </w:r>
       <w:r>
         <w:rPr>
+          <w:rStyle w:val="ae"/>
+          <w:lang w:eastAsia="ja-JP"/>
+        </w:rPr>
+        <w:footnoteReference w:id="15"/>
+      </w:r>
+      <w:r>
+        <w:rPr>
           <w:rFonts w:hint="eastAsia"/>
           <w:lang w:eastAsia="ja-JP"/>
         </w:rPr>
@@ -2184,6 +2346,13 @@
       </w:r>
       <w:r>
         <w:rPr>
+          <w:rStyle w:val="ae"/>
+          <w:lang w:eastAsia="ja-JP"/>
+        </w:rPr>
+        <w:footnoteReference w:id="16"/>
+      </w:r>
+      <w:r>
+        <w:rPr>
           <w:rFonts w:hint="eastAsia"/>
           <w:lang w:eastAsia="ja-JP"/>
         </w:rPr>
@@ -2201,7 +2370,21 @@
           <w:rFonts w:hint="eastAsia"/>
           <w:lang w:eastAsia="ja-JP"/>
         </w:rPr>
-        <w:t>に保存する。保存済みのクラスタリングを選んで「トピック生成」ボタンを押すと、各クラスターの重心（または平均）に近い要素を数件選んで、代表データを算出できる。なお、トピックが重複しないよう、もとのデータからランダムに数件ピックアップし、このデータセット全体が何を表しているかを</w:t>
+        <w:t>に保存する。保存済みのクラスタリングを選んで「トピック</w:t>
+      </w:r>
+      <w:r>
+        <w:rPr>
+          <w:rStyle w:val="ae"/>
+          <w:lang w:eastAsia="ja-JP"/>
+        </w:rPr>
+        <w:footnoteReference w:id="17"/>
+      </w:r>
+      <w:r>
+        <w:rPr>
+          <w:rFonts w:hint="eastAsia"/>
+          <w:lang w:eastAsia="ja-JP"/>
+        </w:rPr>
+        <w:t>生成」ボタンを押すと、各クラスターの重心（または平均）に近い要素を数件選んで、代表データを算出できる。なお、トピックが重複しないよう、もとのデータからランダムに数件ピックアップし、このデータセット全体が何を表しているかを</w:t>
       </w:r>
       <w:r>
         <w:rPr>
@@ -2280,7 +2463,7 @@
           <w:numId w:val="9"/>
         </w:numPr>
       </w:pPr>
-      <w:hyperlink r:id="rId15">
+      <w:hyperlink r:id="rId18">
         <w:r>
           <w:rPr>
             <w:rStyle w:val="af"/>
@@ -2362,6 +2545,7 @@
           <w:rFonts w:hint="eastAsia"/>
           <w:lang w:eastAsia="ja-JP"/>
         </w:rPr>
+        <w:lastRenderedPageBreak/>
         <w:t>CTO</w:t>
       </w:r>
       <w:r>
@@ -2384,7 +2568,6 @@
           <w:rFonts w:hint="eastAsia"/>
           <w:lang w:eastAsia="ja-JP"/>
         </w:rPr>
-        <w:lastRenderedPageBreak/>
         <w:t>ローカル実行で完結することを、どの仕様で担保するか</w:t>
       </w:r>
       <w:r>
@@ -2409,6 +2592,13 @@
       </w:r>
       <w:r>
         <w:rPr>
+          <w:rStyle w:val="ae"/>
+          <w:lang w:eastAsia="ja-JP"/>
+        </w:rPr>
+        <w:footnoteReference w:id="18"/>
+      </w:r>
+      <w:r>
+        <w:rPr>
           <w:rFonts w:hint="eastAsia"/>
           <w:lang w:eastAsia="ja-JP"/>
         </w:rPr>
@@ -2457,6 +2647,13 @@
       </w:r>
       <w:r>
         <w:rPr>
+          <w:rStyle w:val="ae"/>
+          <w:lang w:eastAsia="ja-JP"/>
+        </w:rPr>
+        <w:footnoteReference w:id="19"/>
+      </w:r>
+      <w:r>
+        <w:rPr>
           <w:rFonts w:hint="eastAsia"/>
           <w:lang w:eastAsia="ja-JP"/>
         </w:rPr>
@@ -2557,7 +2754,21 @@
           <w:rFonts w:hint="eastAsia"/>
           <w:lang w:eastAsia="ja-JP"/>
         </w:rPr>
-        <w:t>→入力トークンは</w:t>
+        <w:t>→入力トークン</w:t>
+      </w:r>
+      <w:r>
+        <w:rPr>
+          <w:rStyle w:val="ae"/>
+          <w:lang w:eastAsia="ja-JP"/>
+        </w:rPr>
+        <w:footnoteReference w:id="20"/>
+      </w:r>
+      <w:r>
+        <w:rPr>
+          <w:rFonts w:hint="eastAsia"/>
+          <w:lang w:eastAsia="ja-JP"/>
+        </w:rPr>
+        <w:t>は</w:t>
       </w:r>
       <w:r>
         <w:rPr>
@@ -2607,6 +2818,13 @@
           <w:lang w:eastAsia="ja-JP"/>
         </w:rPr>
         <w:t>8K</w:t>
+      </w:r>
+      <w:r>
+        <w:rPr>
+          <w:rStyle w:val="ae"/>
+          <w:lang w:eastAsia="ja-JP"/>
+        </w:rPr>
+        <w:footnoteReference w:id="21"/>
       </w:r>
       <w:r>
         <w:rPr>
@@ -2706,7 +2924,7 @@
           <w:numId w:val="10"/>
         </w:numPr>
       </w:pPr>
-      <w:hyperlink r:id="rId16">
+      <w:hyperlink r:id="rId19">
         <w:r>
           <w:rPr>
             <w:rStyle w:val="af"/>
@@ -2828,7 +3046,21 @@
           <w:rFonts w:hint="eastAsia"/>
           <w:lang w:eastAsia="ja-JP"/>
         </w:rPr>
-        <w:t>で署名し、社内ネットワークの掲示板経由で配布します</w:t>
+        <w:t>で署名</w:t>
+      </w:r>
+      <w:r>
+        <w:rPr>
+          <w:rStyle w:val="ae"/>
+          <w:lang w:eastAsia="ja-JP"/>
+        </w:rPr>
+        <w:footnoteReference w:id="22"/>
+      </w:r>
+      <w:r>
+        <w:rPr>
+          <w:rFonts w:hint="eastAsia"/>
+          <w:lang w:eastAsia="ja-JP"/>
+        </w:rPr>
+        <w:t>し、社内ネットワークの掲示板経由で配布します</w:t>
       </w:r>
       <w:r>
         <w:rPr>
@@ -2854,7 +3086,15 @@
           <w:rFonts w:hint="eastAsia"/>
           <w:lang w:eastAsia="ja-JP"/>
         </w:rPr>
-        <w:t>埋め込み・クラスタリング状態は保存済みリストで判定します</w:t>
+        <w:t>埋め込み・クラスタリング状態は保存済み</w:t>
+      </w:r>
+      <w:r>
+        <w:rPr>
+          <w:rFonts w:hint="eastAsia"/>
+          <w:lang w:eastAsia="ja-JP"/>
+        </w:rPr>
+        <w:lastRenderedPageBreak/>
+        <w:t>リストで判定します</w:t>
       </w:r>
       <w:r>
         <w:rPr>
@@ -3011,7 +3251,7 @@
           <w:numId w:val="11"/>
         </w:numPr>
       </w:pPr>
-      <w:hyperlink r:id="rId17">
+      <w:hyperlink r:id="rId20">
         <w:r>
           <w:rPr>
             <w:rStyle w:val="af"/>
@@ -3099,7 +3339,7 @@
         </w:rPr>
         <w:t xml:space="preserve"> </w:t>
       </w:r>
-      <w:hyperlink r:id="rId18">
+      <w:hyperlink r:id="rId21">
         <w:r>
           <w:rPr>
             <w:rStyle w:val="af"/>
@@ -3119,7 +3359,6 @@
         <w:rPr>
           <w:rFonts w:hint="eastAsia"/>
         </w:rPr>
-        <w:lastRenderedPageBreak/>
         <w:t>レビュー依頼事項が記載されているので、よく読んで返信を書いてください。</w:t>
       </w:r>
       <w:r>
@@ -3153,7 +3392,7 @@
           <w:numId w:val="12"/>
         </w:numPr>
       </w:pPr>
-      <w:hyperlink r:id="rId19">
+      <w:hyperlink r:id="rId22">
         <w:r>
           <w:rPr>
             <w:rStyle w:val="af"/>
@@ -3258,7 +3497,7 @@
           <w:numId w:val="13"/>
         </w:numPr>
       </w:pPr>
-      <w:hyperlink r:id="rId20">
+      <w:hyperlink r:id="rId23">
         <w:r>
           <w:rPr>
             <w:rStyle w:val="af"/>
@@ -3283,6 +3522,13 @@
       </w:r>
       <w:r>
         <w:rPr>
+          <w:rStyle w:val="ae"/>
+          <w:lang w:eastAsia="ja-JP"/>
+        </w:rPr>
+        <w:footnoteReference w:id="23"/>
+      </w:r>
+      <w:r>
+        <w:rPr>
           <w:rFonts w:hint="eastAsia"/>
           <w:lang w:eastAsia="ja-JP"/>
         </w:rPr>
@@ -3313,7 +3559,21 @@
           <w:rFonts w:hint="eastAsia"/>
           <w:lang w:eastAsia="ja-JP"/>
         </w:rPr>
-        <w:t>で公証まで進めるよう指示し、設計フェイズのドキュメントを書いてください。</w:t>
+        <w:t>で公証</w:t>
+      </w:r>
+      <w:r>
+        <w:rPr>
+          <w:rStyle w:val="ae"/>
+          <w:lang w:eastAsia="ja-JP"/>
+        </w:rPr>
+        <w:footnoteReference w:id="24"/>
+      </w:r>
+      <w:r>
+        <w:rPr>
+          <w:rFonts w:hint="eastAsia"/>
+          <w:lang w:eastAsia="ja-JP"/>
+        </w:rPr>
+        <w:t>まで進めるよう指示し、設計フェイズのドキュメントを書いてください。</w:t>
       </w:r>
     </w:p>
     <w:p>
@@ -3337,7 +3597,7 @@
           <w:numId w:val="14"/>
         </w:numPr>
       </w:pPr>
-      <w:hyperlink r:id="rId21">
+      <w:hyperlink r:id="rId24">
         <w:r>
           <w:rPr>
             <w:rStyle w:val="af"/>
@@ -3361,6 +3621,7 @@
         <w:rPr>
           <w:lang w:eastAsia="ja-JP"/>
         </w:rPr>
+        <w:lastRenderedPageBreak/>
         <w:t xml:space="preserve">P.25 </w:t>
       </w:r>
       <w:r>
@@ -3425,7 +3686,7 @@
         </w:rPr>
         <w:t xml:space="preserve"> </w:t>
       </w:r>
-      <w:hyperlink r:id="rId22">
+      <w:hyperlink r:id="rId25">
         <w:r>
           <w:rPr>
             <w:rStyle w:val="af"/>
@@ -3478,7 +3739,7 @@
           <w:numId w:val="15"/>
         </w:numPr>
       </w:pPr>
-      <w:hyperlink r:id="rId23">
+      <w:hyperlink r:id="rId26">
         <w:r>
           <w:rPr>
             <w:rStyle w:val="af"/>
@@ -3572,7 +3833,6 @@
         <w:rPr>
           <w:rFonts w:hint="eastAsia"/>
         </w:rPr>
-        <w:lastRenderedPageBreak/>
         <w:t>出力ファイル</w:t>
       </w:r>
     </w:p>
@@ -3584,7 +3844,7 @@
           <w:numId w:val="16"/>
         </w:numPr>
       </w:pPr>
-      <w:hyperlink r:id="rId24">
+      <w:hyperlink r:id="rId27">
         <w:r>
           <w:rPr>
             <w:rStyle w:val="af"/>
@@ -3715,6 +3975,13 @@
       </w:r>
       <w:r>
         <w:rPr>
+          <w:rStyle w:val="ae"/>
+          <w:lang w:eastAsia="ja-JP"/>
+        </w:rPr>
+        <w:footnoteReference w:id="25"/>
+      </w:r>
+      <w:r>
+        <w:rPr>
           <w:rFonts w:hint="eastAsia"/>
           <w:lang w:eastAsia="ja-JP"/>
         </w:rPr>
@@ -3779,10 +4046,18 @@
       </w:r>
       <w:r>
         <w:rPr>
+          <w:rStyle w:val="ae"/>
+        </w:rPr>
+        <w:footnoteReference w:id="26"/>
+      </w:r>
+      <w:proofErr w:type="spellStart"/>
+      <w:r>
+        <w:rPr>
           <w:rFonts w:hint="eastAsia"/>
         </w:rPr>
         <w:t>で決定</w:t>
       </w:r>
+      <w:proofErr w:type="spellEnd"/>
     </w:p>
     <w:p>
       <w:pPr>
@@ -3805,7 +4080,7 @@
           <w:numId w:val="18"/>
         </w:numPr>
       </w:pPr>
-      <w:hyperlink r:id="rId25">
+      <w:hyperlink r:id="rId28">
         <w:r>
           <w:rPr>
             <w:rStyle w:val="af"/>
@@ -3880,9 +4155,10 @@
         <w:pStyle w:val="FirstParagraph"/>
       </w:pPr>
       <w:r>
+        <w:lastRenderedPageBreak/>
         <w:t xml:space="preserve"> </w:t>
       </w:r>
-      <w:hyperlink r:id="rId26">
+      <w:hyperlink r:id="rId29">
         <w:r>
           <w:rPr>
             <w:rStyle w:val="af"/>
@@ -3934,7 +4210,7 @@
           <w:numId w:val="19"/>
         </w:numPr>
       </w:pPr>
-      <w:hyperlink r:id="rId27">
+      <w:hyperlink r:id="rId30">
         <w:r>
           <w:rPr>
             <w:rStyle w:val="af"/>
@@ -4032,7 +4308,7 @@
         </w:rPr>
         <w:t xml:space="preserve"> </w:t>
       </w:r>
-      <w:hyperlink r:id="rId28">
+      <w:hyperlink r:id="rId31">
         <w:r>
           <w:rPr>
             <w:rStyle w:val="af"/>
@@ -4083,7 +4359,7 @@
           <w:numId w:val="20"/>
         </w:numPr>
       </w:pPr>
-      <w:hyperlink r:id="rId29">
+      <w:hyperlink r:id="rId32">
         <w:r>
           <w:rPr>
             <w:rStyle w:val="af"/>
@@ -4157,7 +4433,7 @@
       <w:pPr>
         <w:pStyle w:val="FirstParagraph"/>
       </w:pPr>
-      <w:hyperlink r:id="rId30">
+      <w:hyperlink r:id="rId33">
         <w:r>
           <w:rPr>
             <w:rStyle w:val="af"/>
@@ -4279,7 +4555,7 @@
           <w:numId w:val="21"/>
         </w:numPr>
       </w:pPr>
-      <w:hyperlink r:id="rId31">
+      <w:hyperlink r:id="rId34">
         <w:r>
           <w:rPr>
             <w:rStyle w:val="af"/>
@@ -4361,6 +4637,7 @@
           <w:rFonts w:hint="eastAsia"/>
           <w:lang w:eastAsia="ja-JP"/>
         </w:rPr>
+        <w:lastRenderedPageBreak/>
         <w:t>上級エンジニアから実装完了の報告が来ました。</w:t>
       </w:r>
       <w:r>
@@ -4374,7 +4651,7 @@
       <w:pPr>
         <w:pStyle w:val="FirstParagraph"/>
       </w:pPr>
-      <w:hyperlink r:id="rId32">
+      <w:hyperlink r:id="rId35">
         <w:r>
           <w:rPr>
             <w:rStyle w:val="af"/>
@@ -4403,7 +4680,7 @@
           <w:numId w:val="22"/>
         </w:numPr>
       </w:pPr>
-      <w:hyperlink r:id="rId33">
+      <w:hyperlink r:id="rId36">
         <w:r>
           <w:rPr>
             <w:rStyle w:val="af"/>
@@ -4479,7 +4756,7 @@
           <w:numId w:val="23"/>
         </w:numPr>
       </w:pPr>
-      <w:hyperlink r:id="rId34">
+      <w:hyperlink r:id="rId37">
         <w:r>
           <w:rPr>
             <w:rStyle w:val="af"/>
@@ -4496,7 +4773,7 @@
           <w:numId w:val="23"/>
         </w:numPr>
       </w:pPr>
-      <w:hyperlink r:id="rId35">
+      <w:hyperlink r:id="rId38">
         <w:r>
           <w:rPr>
             <w:rStyle w:val="af"/>
@@ -4513,7 +4790,7 @@
           <w:numId w:val="23"/>
         </w:numPr>
       </w:pPr>
-      <w:hyperlink r:id="rId36">
+      <w:hyperlink r:id="rId39">
         <w:r>
           <w:rPr>
             <w:rStyle w:val="af"/>
@@ -4530,7 +4807,7 @@
           <w:numId w:val="23"/>
         </w:numPr>
       </w:pPr>
-      <w:hyperlink r:id="rId37">
+      <w:hyperlink r:id="rId40">
         <w:r>
           <w:rPr>
             <w:rStyle w:val="af"/>
@@ -4554,6 +4831,1858 @@
     </w:sectPr>
   </w:body>
 </w:document>
+</file>
+
+<file path=word/endnotes.xml><?xml version="1.0" encoding="utf-8"?>
+<w:endnotes xmlns:wpc="http://schemas.microsoft.com/office/word/2010/wordprocessingCanvas" xmlns:cx="http://schemas.microsoft.com/office/drawing/2014/chartex" xmlns:cx1="http://schemas.microsoft.com/office/drawing/2015/9/8/chartex" xmlns:cx2="http://schemas.microsoft.com/office/drawing/2015/10/21/chartex" xmlns:cx3="http://schemas.microsoft.com/office/drawing/2016/5/9/chartex" xmlns:cx4="http://schemas.microsoft.com/office/drawing/2016/5/10/chartex" xmlns:cx5="http://schemas.microsoft.com/office/drawing/2016/5/11/chartex" xmlns:cx6="http://schemas.microsoft.com/office/drawing/2016/5/12/chartex" xmlns:cx7="http://schemas.microsoft.com/office/drawing/2016/5/13/chartex" xmlns:cx8="http://schemas.microsoft.com/office/drawing/2016/5/14/chartex" xmlns:mc="http://schemas.openxmlformats.org/markup-compatibility/2006" xmlns:aink="http://schemas.microsoft.com/office/drawing/2016/ink" xmlns:am3d="http://schemas.microsoft.com/office/drawing/2017/model3d" xmlns:o="urn:schemas-microsoft-com:office:office" xmlns:oel="http://schemas.microsoft.com/office/2019/extlst" xmlns:r="http://schemas.openxmlformats.org/officeDocument/2006/relationships" xmlns:m="http://schemas.openxmlformats.org/officeDocument/2006/math" xmlns:v="urn:schemas-microsoft-com:vml" xmlns:wp14="http://schemas.microsoft.com/office/word/2010/wordprocessingDrawing" xmlns:wp="http://schemas.openxmlformats.org/drawingml/2006/wordprocessingDrawing" xmlns:w10="urn:schemas-microsoft-com:office:word" xmlns:w="http://schemas.openxmlformats.org/wordprocessingml/2006/main" xmlns:w14="http://schemas.microsoft.com/office/word/2010/wordml" xmlns:w15="http://schemas.microsoft.com/office/word/2012/wordml" xmlns:w16cex="http://schemas.microsoft.com/office/word/2018/wordml/cex" xmlns:w16cid="http://schemas.microsoft.com/office/word/2016/wordml/cid" xmlns:w16="http://schemas.microsoft.com/office/word/2018/wordml" xmlns:w16du="http://schemas.microsoft.com/office/word/2023/wordml/word16du" xmlns:w16sdtdh="http://schemas.microsoft.com/office/word/2020/wordml/sdtdatahash" xmlns:w16sdtfl="http://schemas.microsoft.com/office/word/2024/wordml/sdtformatlock" xmlns:w16se="http://schemas.microsoft.com/office/word/2015/wordml/symex" xmlns:wpg="http://schemas.microsoft.com/office/word/2010/wordprocessingGroup" xmlns:wpi="http://schemas.microsoft.com/office/word/2010/wordprocessingInk" xmlns:wne="http://schemas.microsoft.com/office/word/2006/wordml" xmlns:wps="http://schemas.microsoft.com/office/word/2010/wordprocessingShape" mc:Ignorable="w14 w15 w16se w16cid w16 w16cex w16sdtdh w16sdtfl w16du wp14">
+  <w:endnote w:type="separator" w:id="-1">
+    <w:p>
+      <w:pPr>
+        <w:spacing w:before="0" w:after="0" w:line="240" w:lineRule="auto"/>
+      </w:pPr>
+      <w:r>
+        <w:separator/>
+      </w:r>
+    </w:p>
+  </w:endnote>
+  <w:endnote w:type="continuationSeparator" w:id="0">
+    <w:p>
+      <w:pPr>
+        <w:spacing w:before="0" w:after="0" w:line="240" w:lineRule="auto"/>
+      </w:pPr>
+      <w:r>
+        <w:continuationSeparator/>
+      </w:r>
+    </w:p>
+  </w:endnote>
+</w:endnotes>
+</file>
+
+<file path=word/footnotes.xml><?xml version="1.0" encoding="utf-8"?>
+<w:footnotes xmlns:wpc="http://schemas.microsoft.com/office/word/2010/wordprocessingCanvas" xmlns:cx="http://schemas.microsoft.com/office/drawing/2014/chartex" xmlns:cx1="http://schemas.microsoft.com/office/drawing/2015/9/8/chartex" xmlns:cx2="http://schemas.microsoft.com/office/drawing/2015/10/21/chartex" xmlns:cx3="http://schemas.microsoft.com/office/drawing/2016/5/9/chartex" xmlns:cx4="http://schemas.microsoft.com/office/drawing/2016/5/10/chartex" xmlns:cx5="http://schemas.microsoft.com/office/drawing/2016/5/11/chartex" xmlns:cx6="http://schemas.microsoft.com/office/drawing/2016/5/12/chartex" xmlns:cx7="http://schemas.microsoft.com/office/drawing/2016/5/13/chartex" xmlns:cx8="http://schemas.microsoft.com/office/drawing/2016/5/14/chartex" xmlns:mc="http://schemas.openxmlformats.org/markup-compatibility/2006" xmlns:aink="http://schemas.microsoft.com/office/drawing/2016/ink" xmlns:am3d="http://schemas.microsoft.com/office/drawing/2017/model3d" xmlns:o="urn:schemas-microsoft-com:office:office" xmlns:oel="http://schemas.microsoft.com/office/2019/extlst" xmlns:r="http://schemas.openxmlformats.org/officeDocument/2006/relationships" xmlns:m="http://schemas.openxmlformats.org/officeDocument/2006/math" xmlns:v="urn:schemas-microsoft-com:vml" xmlns:wp14="http://schemas.microsoft.com/office/word/2010/wordprocessingDrawing" xmlns:wp="http://schemas.openxmlformats.org/drawingml/2006/wordprocessingDrawing" xmlns:w10="urn:schemas-microsoft-com:office:word" xmlns:w="http://schemas.openxmlformats.org/wordprocessingml/2006/main" xmlns:w14="http://schemas.microsoft.com/office/word/2010/wordml" xmlns:w15="http://schemas.microsoft.com/office/word/2012/wordml" xmlns:w16cex="http://schemas.microsoft.com/office/word/2018/wordml/cex" xmlns:w16cid="http://schemas.microsoft.com/office/word/2016/wordml/cid" xmlns:w16="http://schemas.microsoft.com/office/word/2018/wordml" xmlns:w16du="http://schemas.microsoft.com/office/word/2023/wordml/word16du" xmlns:w16sdtdh="http://schemas.microsoft.com/office/word/2020/wordml/sdtdatahash" xmlns:w16sdtfl="http://schemas.microsoft.com/office/word/2024/wordml/sdtformatlock" xmlns:w16se="http://schemas.microsoft.com/office/word/2015/wordml/symex" xmlns:wpg="http://schemas.microsoft.com/office/word/2010/wordprocessingGroup" xmlns:wpi="http://schemas.microsoft.com/office/word/2010/wordprocessingInk" xmlns:wne="http://schemas.microsoft.com/office/word/2006/wordml" xmlns:wps="http://schemas.microsoft.com/office/word/2010/wordprocessingShape" mc:Ignorable="w14 w15 w16se w16cid w16 w16cex w16sdtdh w16sdtfl w16du wp14">
+  <w:footnote w:type="separator" w:id="-1">
+    <w:p>
+      <w:pPr>
+        <w:spacing w:before="0" w:after="0" w:line="240" w:lineRule="auto"/>
+      </w:pPr>
+      <w:r>
+        <w:separator/>
+      </w:r>
+    </w:p>
+  </w:footnote>
+  <w:footnote w:type="continuationSeparator" w:id="0">
+    <w:p>
+      <w:pPr>
+        <w:spacing w:before="0" w:after="0" w:line="240" w:lineRule="auto"/>
+      </w:pPr>
+      <w:r>
+        <w:continuationSeparator/>
+      </w:r>
+    </w:p>
+  </w:footnote>
+  <w:footnote w:id="1">
+    <w:p>
+      <w:pPr>
+        <w:pStyle w:val="ab"/>
+      </w:pPr>
+      <w:r>
+        <w:rPr>
+          <w:rStyle w:val="ae"/>
+        </w:rPr>
+        <w:footnoteRef/>
+      </w:r>
+      <w:r>
+        <w:t xml:space="preserve"> </w:t>
+      </w:r>
+      <w:r>
+        <w:rPr>
+          <w:rFonts w:ascii="Arial" w:hAnsi="Arial" w:cs="Arial"/>
+          <w:color w:val="474747"/>
+          <w:sz w:val="21"/>
+          <w:szCs w:val="21"/>
+          <w:shd w:val="clear" w:color="auto" w:fill="FFFFFF"/>
+        </w:rPr>
+        <w:t>Chief Technology Officer</w:t>
+      </w:r>
+      <w:r>
+        <w:rPr>
+          <w:rFonts w:ascii="Arial" w:hAnsi="Arial" w:cs="Arial"/>
+          <w:color w:val="474747"/>
+          <w:sz w:val="21"/>
+          <w:szCs w:val="21"/>
+          <w:shd w:val="clear" w:color="auto" w:fill="FFFFFF"/>
+        </w:rPr>
+        <w:t xml:space="preserve">: </w:t>
+      </w:r>
+      <w:proofErr w:type="spellStart"/>
+      <w:r>
+        <w:rPr>
+          <w:rFonts w:ascii="Arial" w:hAnsi="Arial" w:cs="Arial"/>
+          <w:color w:val="474747"/>
+          <w:sz w:val="21"/>
+          <w:szCs w:val="21"/>
+          <w:shd w:val="clear" w:color="auto" w:fill="FFFFFF"/>
+        </w:rPr>
+        <w:t>最高技術責任者</w:t>
+      </w:r>
+      <w:proofErr w:type="spellEnd"/>
+    </w:p>
+  </w:footnote>
+  <w:footnote w:id="2">
+    <w:p>
+      <w:pPr>
+        <w:pStyle w:val="ab"/>
+        <w:rPr>
+          <w:rFonts w:hint="eastAsia"/>
+          <w:lang w:eastAsia="ja-JP"/>
+        </w:rPr>
+      </w:pPr>
+      <w:r>
+        <w:rPr>
+          <w:rStyle w:val="ae"/>
+        </w:rPr>
+        <w:footnoteRef/>
+      </w:r>
+      <w:r>
+        <w:t xml:space="preserve"> </w:t>
+      </w:r>
+      <w:r>
+        <w:rPr>
+          <w:rFonts w:hint="eastAsia"/>
+          <w:lang w:eastAsia="ja-JP"/>
+        </w:rPr>
+        <w:t>この文書内では、開発チームの現場トップの想定</w:t>
+      </w:r>
+    </w:p>
+  </w:footnote>
+  <w:footnote w:id="3">
+    <w:p>
+      <w:pPr>
+        <w:pStyle w:val="ab"/>
+        <w:rPr>
+          <w:rFonts w:hint="eastAsia"/>
+          <w:lang w:eastAsia="ja-JP"/>
+        </w:rPr>
+      </w:pPr>
+      <w:r>
+        <w:rPr>
+          <w:rStyle w:val="ae"/>
+        </w:rPr>
+        <w:footnoteRef/>
+      </w:r>
+      <w:r>
+        <w:rPr>
+          <w:lang w:eastAsia="ja-JP"/>
+        </w:rPr>
+        <w:t>文章の構造や装飾を記号</w:t>
+      </w:r>
+      <w:r>
+        <w:rPr>
+          <w:rFonts w:hint="eastAsia"/>
+          <w:lang w:eastAsia="ja-JP"/>
+        </w:rPr>
+        <w:t>で</w:t>
+      </w:r>
+      <w:r>
+        <w:rPr>
+          <w:lang w:eastAsia="ja-JP"/>
+        </w:rPr>
+        <w:t>指定</w:t>
+      </w:r>
+      <w:r>
+        <w:rPr>
+          <w:rFonts w:hint="eastAsia"/>
+          <w:lang w:eastAsia="ja-JP"/>
+        </w:rPr>
+        <w:t>す</w:t>
+      </w:r>
+      <w:r>
+        <w:rPr>
+          <w:lang w:eastAsia="ja-JP"/>
+        </w:rPr>
+        <w:t>るマークアップ言語</w:t>
+      </w:r>
+    </w:p>
+  </w:footnote>
+  <w:footnote w:id="4">
+    <w:p>
+      <w:pPr>
+        <w:pStyle w:val="ab"/>
+        <w:rPr>
+          <w:rFonts w:hint="eastAsia"/>
+          <w:lang w:eastAsia="ja-JP"/>
+        </w:rPr>
+      </w:pPr>
+      <w:r>
+        <w:rPr>
+          <w:rStyle w:val="ae"/>
+        </w:rPr>
+        <w:footnoteRef/>
+      </w:r>
+      <w:r>
+        <w:rPr>
+          <w:lang w:eastAsia="ja-JP"/>
+        </w:rPr>
+        <w:t xml:space="preserve"> </w:t>
+      </w:r>
+      <w:r>
+        <w:rPr>
+          <w:lang w:eastAsia="ja-JP"/>
+        </w:rPr>
+        <w:t>アプリケーションやシステムを開発・運用するために組み合わせるプログラミング言語、フレームワーク、データベース、ツールなどの</w:t>
+      </w:r>
+      <w:r>
+        <w:rPr>
+          <w:rFonts w:hint="eastAsia"/>
+          <w:lang w:eastAsia="ja-JP"/>
+        </w:rPr>
+        <w:t>構成のこと</w:t>
+      </w:r>
+      <w:r>
+        <w:rPr>
+          <w:lang w:eastAsia="ja-JP"/>
+        </w:rPr>
+        <w:t>。フロントエンド（画面）とバックエンド（サーバー）の技術を積み重ね</w:t>
+      </w:r>
+      <w:r>
+        <w:rPr>
+          <w:rFonts w:hint="eastAsia"/>
+          <w:lang w:eastAsia="ja-JP"/>
+        </w:rPr>
+        <w:t>た一式であり</w:t>
+      </w:r>
+      <w:r>
+        <w:rPr>
+          <w:lang w:eastAsia="ja-JP"/>
+        </w:rPr>
+        <w:t>、</w:t>
+      </w:r>
+      <w:r>
+        <w:rPr>
+          <w:rFonts w:hint="eastAsia"/>
+          <w:lang w:eastAsia="ja-JP"/>
+        </w:rPr>
+        <w:t>実装の難易度、</w:t>
+      </w:r>
+      <w:r>
+        <w:rPr>
+          <w:lang w:eastAsia="ja-JP"/>
+        </w:rPr>
+        <w:t>保守性</w:t>
+      </w:r>
+      <w:r>
+        <w:rPr>
+          <w:rFonts w:hint="eastAsia"/>
+          <w:lang w:eastAsia="ja-JP"/>
+        </w:rPr>
+        <w:t>、コストが定まる。</w:t>
+      </w:r>
+    </w:p>
+  </w:footnote>
+  <w:footnote w:id="5">
+    <w:p>
+      <w:pPr>
+        <w:pStyle w:val="ab"/>
+        <w:rPr>
+          <w:rFonts w:hint="eastAsia"/>
+          <w:lang w:eastAsia="ja-JP"/>
+        </w:rPr>
+      </w:pPr>
+      <w:r>
+        <w:rPr>
+          <w:rStyle w:val="ae"/>
+        </w:rPr>
+        <w:footnoteRef/>
+      </w:r>
+      <w:r>
+        <w:rPr>
+          <w:lang w:eastAsia="ja-JP"/>
+        </w:rPr>
+        <w:t xml:space="preserve"> </w:t>
+      </w:r>
+      <w:r>
+        <w:rPr>
+          <w:lang w:eastAsia="ja-JP"/>
+        </w:rPr>
+        <w:t>Apple</w:t>
+      </w:r>
+      <w:r>
+        <w:rPr>
+          <w:lang w:eastAsia="ja-JP"/>
+        </w:rPr>
+        <w:t>プラットフォーム（</w:t>
+      </w:r>
+      <w:r>
+        <w:rPr>
+          <w:lang w:eastAsia="ja-JP"/>
+        </w:rPr>
+        <w:t>iOS</w:t>
+      </w:r>
+      <w:r>
+        <w:rPr>
+          <w:lang w:eastAsia="ja-JP"/>
+        </w:rPr>
+        <w:t>、</w:t>
+      </w:r>
+      <w:r>
+        <w:rPr>
+          <w:lang w:eastAsia="ja-JP"/>
+        </w:rPr>
+        <w:t>macOS</w:t>
+      </w:r>
+      <w:r>
+        <w:rPr>
+          <w:lang w:eastAsia="ja-JP"/>
+        </w:rPr>
+        <w:t>、</w:t>
+      </w:r>
+      <w:r>
+        <w:rPr>
+          <w:lang w:eastAsia="ja-JP"/>
+        </w:rPr>
+        <w:t>watchOS</w:t>
+      </w:r>
+      <w:r>
+        <w:rPr>
+          <w:lang w:eastAsia="ja-JP"/>
+        </w:rPr>
+        <w:t>、</w:t>
+      </w:r>
+      <w:r>
+        <w:rPr>
+          <w:lang w:eastAsia="ja-JP"/>
+        </w:rPr>
+        <w:t>tvOS</w:t>
+      </w:r>
+      <w:r>
+        <w:rPr>
+          <w:lang w:eastAsia="ja-JP"/>
+        </w:rPr>
+        <w:t>、</w:t>
+      </w:r>
+      <w:proofErr w:type="spellStart"/>
+      <w:r>
+        <w:rPr>
+          <w:lang w:eastAsia="ja-JP"/>
+        </w:rPr>
+        <w:t>visionOS</w:t>
+      </w:r>
+      <w:proofErr w:type="spellEnd"/>
+      <w:r>
+        <w:rPr>
+          <w:lang w:eastAsia="ja-JP"/>
+        </w:rPr>
+        <w:t>）向けのユーザーインターフェイスを構築するための</w:t>
+      </w:r>
+      <w:r>
+        <w:rPr>
+          <w:lang w:eastAsia="ja-JP"/>
+        </w:rPr>
+        <w:t>UI</w:t>
+      </w:r>
+      <w:r>
+        <w:rPr>
+          <w:lang w:eastAsia="ja-JP"/>
+        </w:rPr>
+        <w:t>フレームワーク</w:t>
+      </w:r>
+      <w:r>
+        <w:rPr>
+          <w:rFonts w:hint="eastAsia"/>
+          <w:lang w:eastAsia="ja-JP"/>
+        </w:rPr>
+        <w:t>のこと。</w:t>
+      </w:r>
+    </w:p>
+  </w:footnote>
+  <w:footnote w:id="6">
+    <w:p>
+      <w:pPr>
+        <w:pStyle w:val="ab"/>
+        <w:rPr>
+          <w:rFonts w:hint="eastAsia"/>
+          <w:lang w:eastAsia="ja-JP"/>
+        </w:rPr>
+      </w:pPr>
+      <w:r>
+        <w:rPr>
+          <w:rStyle w:val="ae"/>
+        </w:rPr>
+        <w:footnoteRef/>
+      </w:r>
+      <w:r>
+        <w:rPr>
+          <w:lang w:eastAsia="ja-JP"/>
+        </w:rPr>
+        <w:t xml:space="preserve"> </w:t>
+      </w:r>
+      <w:r>
+        <w:rPr>
+          <w:rFonts w:hint="eastAsia"/>
+          <w:lang w:eastAsia="ja-JP"/>
+        </w:rPr>
+        <w:t>Apple</w:t>
+      </w:r>
+      <w:r>
+        <w:rPr>
+          <w:rFonts w:hint="eastAsia"/>
+          <w:lang w:eastAsia="ja-JP"/>
+        </w:rPr>
+        <w:t>が</w:t>
+      </w:r>
+      <w:r>
+        <w:rPr>
+          <w:rFonts w:hint="eastAsia"/>
+          <w:lang w:eastAsia="ja-JP"/>
+        </w:rPr>
+        <w:t>2014</w:t>
+      </w:r>
+      <w:r>
+        <w:rPr>
+          <w:rFonts w:hint="eastAsia"/>
+          <w:lang w:eastAsia="ja-JP"/>
+        </w:rPr>
+        <w:t>年に発表したプログラミング言語</w:t>
+      </w:r>
+      <w:r>
+        <w:rPr>
+          <w:rFonts w:hint="eastAsia"/>
+          <w:lang w:eastAsia="ja-JP"/>
+        </w:rPr>
+        <w:t>で、</w:t>
+      </w:r>
+      <w:r>
+        <w:rPr>
+          <w:rFonts w:hint="eastAsia"/>
+          <w:lang w:eastAsia="ja-JP"/>
+        </w:rPr>
+        <w:t>iPhone</w:t>
+      </w:r>
+      <w:r>
+        <w:rPr>
+          <w:rFonts w:hint="eastAsia"/>
+          <w:lang w:eastAsia="ja-JP"/>
+        </w:rPr>
+        <w:t>（</w:t>
+      </w:r>
+      <w:r>
+        <w:rPr>
+          <w:rFonts w:hint="eastAsia"/>
+          <w:lang w:eastAsia="ja-JP"/>
+        </w:rPr>
+        <w:t>iOS</w:t>
+      </w:r>
+      <w:r>
+        <w:rPr>
+          <w:rFonts w:hint="eastAsia"/>
+          <w:lang w:eastAsia="ja-JP"/>
+        </w:rPr>
+        <w:t>）や</w:t>
+      </w:r>
+      <w:r>
+        <w:rPr>
+          <w:rFonts w:hint="eastAsia"/>
+          <w:lang w:eastAsia="ja-JP"/>
+        </w:rPr>
+        <w:t>Mac</w:t>
+      </w:r>
+      <w:r>
+        <w:rPr>
+          <w:rFonts w:hint="eastAsia"/>
+          <w:lang w:eastAsia="ja-JP"/>
+        </w:rPr>
+        <w:t>（</w:t>
+      </w:r>
+      <w:r>
+        <w:rPr>
+          <w:rFonts w:hint="eastAsia"/>
+          <w:lang w:eastAsia="ja-JP"/>
+        </w:rPr>
+        <w:t>macOS</w:t>
+      </w:r>
+      <w:r>
+        <w:rPr>
+          <w:rFonts w:hint="eastAsia"/>
+          <w:lang w:eastAsia="ja-JP"/>
+        </w:rPr>
+        <w:t>）などの</w:t>
+      </w:r>
+      <w:r>
+        <w:rPr>
+          <w:rFonts w:hint="eastAsia"/>
+          <w:lang w:eastAsia="ja-JP"/>
+        </w:rPr>
+        <w:t>Apple</w:t>
+      </w:r>
+      <w:r>
+        <w:rPr>
+          <w:rFonts w:hint="eastAsia"/>
+          <w:lang w:eastAsia="ja-JP"/>
+        </w:rPr>
+        <w:t>製品向けのアプリを開発するために作られたが、現在はオープンソース化されており、サーバーサイド開発など幅広い用途で使われて</w:t>
+      </w:r>
+      <w:r>
+        <w:rPr>
+          <w:rFonts w:hint="eastAsia"/>
+          <w:lang w:eastAsia="ja-JP"/>
+        </w:rPr>
+        <w:t>いる。</w:t>
+      </w:r>
+    </w:p>
+  </w:footnote>
+  <w:footnote w:id="7">
+    <w:p>
+      <w:pPr>
+        <w:pStyle w:val="ab"/>
+        <w:rPr>
+          <w:rFonts w:hint="eastAsia"/>
+          <w:lang w:eastAsia="ja-JP"/>
+        </w:rPr>
+      </w:pPr>
+      <w:r>
+        <w:rPr>
+          <w:rStyle w:val="ae"/>
+        </w:rPr>
+        <w:footnoteRef/>
+      </w:r>
+      <w:r>
+        <w:rPr>
+          <w:lang w:eastAsia="ja-JP"/>
+        </w:rPr>
+        <w:t>複数の非同期処理を親子関係で管理するための仕組み</w:t>
+      </w:r>
+      <w:r>
+        <w:rPr>
+          <w:rFonts w:hint="eastAsia"/>
+          <w:lang w:eastAsia="ja-JP"/>
+        </w:rPr>
+        <w:t>のこと。</w:t>
+      </w:r>
+      <w:r>
+        <w:rPr>
+          <w:lang w:eastAsia="ja-JP"/>
+        </w:rPr>
+        <w:t>Swift 5.5</w:t>
+      </w:r>
+      <w:r>
+        <w:rPr>
+          <w:rFonts w:hint="eastAsia"/>
+          <w:lang w:eastAsia="ja-JP"/>
+        </w:rPr>
+        <w:t>で導入された。</w:t>
+      </w:r>
+    </w:p>
+  </w:footnote>
+  <w:footnote w:id="8">
+    <w:p>
+      <w:pPr>
+        <w:pStyle w:val="ab"/>
+        <w:rPr>
+          <w:rFonts w:hint="eastAsia"/>
+          <w:lang w:eastAsia="ja-JP"/>
+        </w:rPr>
+      </w:pPr>
+      <w:r>
+        <w:rPr>
+          <w:rStyle w:val="ae"/>
+        </w:rPr>
+        <w:footnoteRef/>
+      </w:r>
+      <w:r>
+        <w:rPr>
+          <w:lang w:eastAsia="ja-JP"/>
+        </w:rPr>
+        <w:t xml:space="preserve"> </w:t>
+      </w:r>
+      <w:r>
+        <w:rPr>
+          <w:lang w:eastAsia="ja-JP"/>
+        </w:rPr>
+        <w:t>CPU</w:t>
+      </w:r>
+      <w:r>
+        <w:rPr>
+          <w:lang w:eastAsia="ja-JP"/>
+        </w:rPr>
+        <w:t>のベクトル演算機能を最大限に活用して、数学的演算や画像処理を高速化するためのフレームワーク</w:t>
+      </w:r>
+      <w:r>
+        <w:rPr>
+          <w:rFonts w:hint="eastAsia"/>
+          <w:lang w:eastAsia="ja-JP"/>
+        </w:rPr>
+        <w:t>。</w:t>
+      </w:r>
+      <w:r>
+        <w:rPr>
+          <w:lang w:eastAsia="ja-JP"/>
+        </w:rPr>
+        <w:t>Apple Silicon</w:t>
+      </w:r>
+      <w:r>
+        <w:rPr>
+          <w:lang w:eastAsia="ja-JP"/>
+        </w:rPr>
+        <w:t>（</w:t>
+      </w:r>
+      <w:r>
+        <w:rPr>
+          <w:lang w:eastAsia="ja-JP"/>
+        </w:rPr>
+        <w:t>M1/M2/M3/M4</w:t>
+      </w:r>
+      <w:r>
+        <w:rPr>
+          <w:lang w:eastAsia="ja-JP"/>
+        </w:rPr>
+        <w:t>など）に搭載された行列演算用ユニット</w:t>
+      </w:r>
+      <w:r>
+        <w:rPr>
+          <w:lang w:eastAsia="ja-JP"/>
+        </w:rPr>
+        <w:t>AMX (Apple Matrix Coprocessor)</w:t>
+      </w:r>
+      <w:r>
+        <w:rPr>
+          <w:lang w:eastAsia="ja-JP"/>
+        </w:rPr>
+        <w:t>を自動的に利用</w:t>
+      </w:r>
+      <w:r>
+        <w:rPr>
+          <w:rFonts w:hint="eastAsia"/>
+          <w:lang w:eastAsia="ja-JP"/>
+        </w:rPr>
+        <w:t>するため、</w:t>
+      </w:r>
+      <w:r>
+        <w:rPr>
+          <w:lang w:eastAsia="ja-JP"/>
+        </w:rPr>
+        <w:t>通常のベクトル命令（</w:t>
+      </w:r>
+      <w:r>
+        <w:rPr>
+          <w:lang w:eastAsia="ja-JP"/>
+        </w:rPr>
+        <w:t>NEON</w:t>
+      </w:r>
+      <w:r>
+        <w:rPr>
+          <w:lang w:eastAsia="ja-JP"/>
+        </w:rPr>
+        <w:t>）を使うよりも、</w:t>
+      </w:r>
+      <w:r>
+        <w:rPr>
+          <w:rFonts w:hint="eastAsia"/>
+          <w:lang w:eastAsia="ja-JP"/>
+        </w:rPr>
+        <w:t>条件にもよるが</w:t>
+      </w:r>
+      <w:r>
+        <w:rPr>
+          <w:lang w:eastAsia="ja-JP"/>
+        </w:rPr>
+        <w:t>行列演算が</w:t>
+      </w:r>
+      <w:r>
+        <w:rPr>
+          <w:lang w:eastAsia="ja-JP"/>
+        </w:rPr>
+        <w:t>10</w:t>
+      </w:r>
+      <w:r>
+        <w:rPr>
+          <w:lang w:eastAsia="ja-JP"/>
+        </w:rPr>
+        <w:t>倍以上速くなる</w:t>
+      </w:r>
+      <w:r>
+        <w:rPr>
+          <w:rFonts w:hint="eastAsia"/>
+          <w:lang w:eastAsia="ja-JP"/>
+        </w:rPr>
+        <w:t>。</w:t>
+      </w:r>
+    </w:p>
+  </w:footnote>
+  <w:footnote w:id="9">
+    <w:p>
+      <w:pPr>
+        <w:pStyle w:val="ab"/>
+        <w:rPr>
+          <w:rFonts w:hint="eastAsia"/>
+          <w:lang w:eastAsia="ja-JP"/>
+        </w:rPr>
+      </w:pPr>
+      <w:r>
+        <w:rPr>
+          <w:rStyle w:val="ae"/>
+        </w:rPr>
+        <w:footnoteRef/>
+      </w:r>
+      <w:r>
+        <w:rPr>
+          <w:rFonts w:hint="eastAsia"/>
+          <w:lang w:eastAsia="ja-JP"/>
+        </w:rPr>
+        <w:t>サーバーレスな軽量リレーショナルデータベース（</w:t>
+      </w:r>
+      <w:r>
+        <w:rPr>
+          <w:rFonts w:hint="eastAsia"/>
+          <w:lang w:eastAsia="ja-JP"/>
+        </w:rPr>
+        <w:t>RDBMS</w:t>
+      </w:r>
+      <w:r>
+        <w:rPr>
+          <w:rFonts w:hint="eastAsia"/>
+          <w:lang w:eastAsia="ja-JP"/>
+        </w:rPr>
+        <w:t>）</w:t>
+      </w:r>
+      <w:r>
+        <w:rPr>
+          <w:rFonts w:hint="eastAsia"/>
+          <w:lang w:eastAsia="ja-JP"/>
+        </w:rPr>
+        <w:t>。</w:t>
+      </w:r>
+      <w:r>
+        <w:rPr>
+          <w:rFonts w:hint="eastAsia"/>
+          <w:lang w:eastAsia="ja-JP"/>
+        </w:rPr>
+        <w:t>Apple</w:t>
+      </w:r>
+      <w:r>
+        <w:rPr>
+          <w:rFonts w:hint="eastAsia"/>
+          <w:lang w:eastAsia="ja-JP"/>
+        </w:rPr>
+        <w:t>プラットフォームの開発</w:t>
+      </w:r>
+      <w:r>
+        <w:rPr>
+          <w:rFonts w:hint="eastAsia"/>
+          <w:lang w:eastAsia="ja-JP"/>
+        </w:rPr>
+        <w:t>で</w:t>
+      </w:r>
+      <w:r>
+        <w:rPr>
+          <w:rFonts w:hint="eastAsia"/>
+          <w:lang w:eastAsia="ja-JP"/>
+        </w:rPr>
+        <w:t>は、デバイス内のローカルデータ保存に欠かせない重要な役割を担</w:t>
+      </w:r>
+      <w:r>
+        <w:rPr>
+          <w:rFonts w:hint="eastAsia"/>
+          <w:lang w:eastAsia="ja-JP"/>
+        </w:rPr>
+        <w:t>う。</w:t>
+      </w:r>
+    </w:p>
+  </w:footnote>
+  <w:footnote w:id="10">
+    <w:p>
+      <w:pPr>
+        <w:pStyle w:val="ab"/>
+        <w:rPr>
+          <w:rFonts w:hint="eastAsia"/>
+          <w:lang w:eastAsia="ja-JP"/>
+        </w:rPr>
+      </w:pPr>
+      <w:r>
+        <w:rPr>
+          <w:rStyle w:val="ae"/>
+        </w:rPr>
+        <w:footnoteRef/>
+      </w:r>
+      <w:r>
+        <w:rPr>
+          <w:lang w:eastAsia="ja-JP"/>
+        </w:rPr>
+        <w:t xml:space="preserve"> </w:t>
+      </w:r>
+      <w:r>
+        <w:rPr>
+          <w:rFonts w:hint="eastAsia"/>
+          <w:lang w:eastAsia="ja-JP"/>
+        </w:rPr>
+        <w:t>広く普及していた</w:t>
+      </w:r>
+      <w:r>
+        <w:rPr>
+          <w:rFonts w:hint="eastAsia"/>
+          <w:lang w:eastAsia="ja-JP"/>
+        </w:rPr>
+        <w:t>CSV</w:t>
+      </w:r>
+      <w:r>
+        <w:rPr>
+          <w:rFonts w:hint="eastAsia"/>
+          <w:lang w:eastAsia="ja-JP"/>
+        </w:rPr>
+        <w:t>を公式化した</w:t>
+      </w:r>
+      <w:r>
+        <w:rPr>
+          <w:rFonts w:hint="eastAsia"/>
+          <w:lang w:eastAsia="ja-JP"/>
+        </w:rPr>
+        <w:t>仕様</w:t>
+      </w:r>
+      <w:r>
+        <w:rPr>
+          <w:rFonts w:hint="eastAsia"/>
+          <w:lang w:eastAsia="ja-JP"/>
+        </w:rPr>
+        <w:t>（</w:t>
+      </w:r>
+      <w:r>
+        <w:rPr>
+          <w:rFonts w:hint="eastAsia"/>
+          <w:lang w:eastAsia="ja-JP"/>
+        </w:rPr>
+        <w:t>2005</w:t>
+      </w:r>
+      <w:r>
+        <w:rPr>
+          <w:rFonts w:hint="eastAsia"/>
+          <w:lang w:eastAsia="ja-JP"/>
+        </w:rPr>
+        <w:t>年策定）。エスケープ処理やダブルクォート内に値としてカンマや改行を記述できるなど、ベンダーごとの</w:t>
+      </w:r>
+      <w:r>
+        <w:rPr>
+          <w:rFonts w:hint="eastAsia"/>
+          <w:lang w:eastAsia="ja-JP"/>
+        </w:rPr>
+        <w:t>CSV</w:t>
+      </w:r>
+      <w:r>
+        <w:rPr>
+          <w:rFonts w:hint="eastAsia"/>
+          <w:lang w:eastAsia="ja-JP"/>
+        </w:rPr>
+        <w:t>の仕様の違いがまとめられた。</w:t>
+      </w:r>
+    </w:p>
+  </w:footnote>
+  <w:footnote w:id="11">
+    <w:p>
+      <w:pPr>
+        <w:pStyle w:val="ab"/>
+        <w:rPr>
+          <w:rFonts w:hint="eastAsia"/>
+          <w:lang w:eastAsia="ja-JP"/>
+        </w:rPr>
+      </w:pPr>
+      <w:r>
+        <w:rPr>
+          <w:rStyle w:val="ae"/>
+        </w:rPr>
+        <w:footnoteRef/>
+      </w:r>
+      <w:r>
+        <w:rPr>
+          <w:lang w:eastAsia="ja-JP"/>
+        </w:rPr>
+        <w:t xml:space="preserve"> </w:t>
+      </w:r>
+      <w:r>
+        <w:rPr>
+          <w:lang w:eastAsia="ja-JP"/>
+        </w:rPr>
+        <w:t xml:space="preserve">Byte Order Mark / </w:t>
+      </w:r>
+      <w:r>
+        <w:rPr>
+          <w:lang w:eastAsia="ja-JP"/>
+        </w:rPr>
+        <w:t>バイト順マーク</w:t>
+      </w:r>
+      <w:r>
+        <w:rPr>
+          <w:rFonts w:hint="eastAsia"/>
+          <w:lang w:eastAsia="ja-JP"/>
+        </w:rPr>
+        <w:t>のこと。</w:t>
+      </w:r>
+      <w:r>
+        <w:rPr>
+          <w:rFonts w:hint="eastAsia"/>
+          <w:lang w:eastAsia="ja-JP"/>
+        </w:rPr>
+        <w:t>テキストファイルの先頭に付与され</w:t>
+      </w:r>
+      <w:r>
+        <w:rPr>
+          <w:rFonts w:hint="eastAsia"/>
+          <w:lang w:eastAsia="ja-JP"/>
+        </w:rPr>
+        <w:t>る符号。</w:t>
+      </w:r>
+      <w:r>
+        <w:rPr>
+          <w:rFonts w:hint="eastAsia"/>
+          <w:lang w:eastAsia="ja-JP"/>
+        </w:rPr>
+        <w:t>「そのファイルがどの文字コード（</w:t>
+      </w:r>
+      <w:r>
+        <w:rPr>
+          <w:rFonts w:hint="eastAsia"/>
+          <w:lang w:eastAsia="ja-JP"/>
+        </w:rPr>
+        <w:t>Unicode</w:t>
+      </w:r>
+      <w:r>
+        <w:rPr>
+          <w:rFonts w:hint="eastAsia"/>
+          <w:lang w:eastAsia="ja-JP"/>
+        </w:rPr>
+        <w:t>）で書かれているか」をプログラムやアプリに</w:t>
+      </w:r>
+      <w:r>
+        <w:rPr>
+          <w:rFonts w:hint="eastAsia"/>
+          <w:lang w:eastAsia="ja-JP"/>
+        </w:rPr>
+        <w:t>伝える。</w:t>
+      </w:r>
+    </w:p>
+  </w:footnote>
+  <w:footnote w:id="12">
+    <w:p>
+      <w:pPr>
+        <w:pStyle w:val="ab"/>
+        <w:rPr>
+          <w:rFonts w:hint="eastAsia"/>
+          <w:lang w:eastAsia="ja-JP"/>
+        </w:rPr>
+      </w:pPr>
+      <w:r>
+        <w:rPr>
+          <w:rStyle w:val="ae"/>
+        </w:rPr>
+        <w:footnoteRef/>
+      </w:r>
+      <w:r>
+        <w:rPr>
+          <w:lang w:eastAsia="ja-JP"/>
+        </w:rPr>
+        <w:t xml:space="preserve"> </w:t>
+      </w:r>
+      <w:r>
+        <w:rPr>
+          <w:rFonts w:ascii="Arial" w:hAnsi="Arial" w:cs="Arial"/>
+          <w:color w:val="0A0A0A"/>
+          <w:shd w:val="clear" w:color="auto" w:fill="FFFFFF"/>
+          <w:lang w:eastAsia="ja-JP"/>
+        </w:rPr>
+        <w:t>SwiftUI</w:t>
+      </w:r>
+      <w:r>
+        <w:rPr>
+          <w:rFonts w:ascii="Arial" w:hAnsi="Arial" w:cs="Arial" w:hint="eastAsia"/>
+          <w:color w:val="0A0A0A"/>
+          <w:shd w:val="clear" w:color="auto" w:fill="FFFFFF"/>
+          <w:lang w:eastAsia="ja-JP"/>
+        </w:rPr>
+        <w:t>用の</w:t>
+      </w:r>
+      <w:r>
+        <w:rPr>
+          <w:rFonts w:ascii="Arial" w:hAnsi="Arial" w:cs="Arial"/>
+          <w:color w:val="0A0A0A"/>
+          <w:shd w:val="clear" w:color="auto" w:fill="FFFFFF"/>
+          <w:lang w:eastAsia="ja-JP"/>
+        </w:rPr>
+        <w:t>グラフ作成用フレームワーク</w:t>
+      </w:r>
+      <w:r>
+        <w:rPr>
+          <w:rFonts w:ascii="Arial" w:hAnsi="Arial" w:cs="Arial" w:hint="eastAsia"/>
+          <w:color w:val="0A0A0A"/>
+          <w:shd w:val="clear" w:color="auto" w:fill="FFFFFF"/>
+          <w:lang w:eastAsia="ja-JP"/>
+        </w:rPr>
+        <w:t>のこと。</w:t>
+      </w:r>
+    </w:p>
+  </w:footnote>
+  <w:footnote w:id="13">
+    <w:p>
+      <w:pPr>
+        <w:pStyle w:val="ab"/>
+        <w:rPr>
+          <w:rFonts w:hint="eastAsia"/>
+          <w:lang w:eastAsia="ja-JP"/>
+        </w:rPr>
+      </w:pPr>
+      <w:r>
+        <w:rPr>
+          <w:rStyle w:val="ae"/>
+        </w:rPr>
+        <w:footnoteRef/>
+      </w:r>
+      <w:r>
+        <w:rPr>
+          <w:lang w:eastAsia="ja-JP"/>
+        </w:rPr>
+        <w:t xml:space="preserve"> </w:t>
+      </w:r>
+      <w:r>
+        <w:rPr>
+          <w:lang w:eastAsia="ja-JP"/>
+        </w:rPr>
+        <w:t>大量のデータの中から、似た性質を持つもの同士をグループ（クラスタ）に分ける手法のこと</w:t>
+      </w:r>
+      <w:r>
+        <w:rPr>
+          <w:rFonts w:hint="eastAsia"/>
+          <w:lang w:eastAsia="ja-JP"/>
+        </w:rPr>
+        <w:t>。</w:t>
+      </w:r>
+    </w:p>
+  </w:footnote>
+  <w:footnote w:id="14">
+    <w:p>
+      <w:pPr>
+        <w:pStyle w:val="ab"/>
+        <w:rPr>
+          <w:rFonts w:hint="eastAsia"/>
+          <w:lang w:eastAsia="ja-JP"/>
+        </w:rPr>
+      </w:pPr>
+      <w:r>
+        <w:rPr>
+          <w:rStyle w:val="ae"/>
+        </w:rPr>
+        <w:footnoteRef/>
+      </w:r>
+      <w:r>
+        <w:rPr>
+          <w:lang w:eastAsia="ja-JP"/>
+        </w:rPr>
+        <w:t xml:space="preserve"> </w:t>
+      </w:r>
+      <w:r>
+        <w:rPr>
+          <w:lang w:eastAsia="ja-JP"/>
+        </w:rPr>
+        <w:t>テキスト、画像、音声などの高次元なデータを、コンピュータが扱いやすい固定長のベクトル</w:t>
+      </w:r>
+      <w:r>
+        <w:rPr>
+          <w:rFonts w:hint="eastAsia"/>
+          <w:lang w:eastAsia="ja-JP"/>
+        </w:rPr>
+        <w:t>（高次元の行列）</w:t>
+      </w:r>
+      <w:r>
+        <w:rPr>
+          <w:lang w:eastAsia="ja-JP"/>
+        </w:rPr>
+        <w:t>に変換すること</w:t>
+      </w:r>
+      <w:r>
+        <w:rPr>
+          <w:rFonts w:hint="eastAsia"/>
+          <w:lang w:eastAsia="ja-JP"/>
+        </w:rPr>
+        <w:t>。</w:t>
+      </w:r>
+    </w:p>
+  </w:footnote>
+  <w:footnote w:id="15">
+    <w:p>
+      <w:pPr>
+        <w:pStyle w:val="ab"/>
+        <w:rPr>
+          <w:rFonts w:hint="eastAsia"/>
+          <w:lang w:eastAsia="ja-JP"/>
+        </w:rPr>
+      </w:pPr>
+      <w:r>
+        <w:rPr>
+          <w:rStyle w:val="ae"/>
+        </w:rPr>
+        <w:footnoteRef/>
+      </w:r>
+      <w:r>
+        <w:rPr>
+          <w:lang w:eastAsia="ja-JP"/>
+        </w:rPr>
+        <w:t>クラスタリング</w:t>
+      </w:r>
+      <w:r>
+        <w:rPr>
+          <w:rFonts w:hint="eastAsia"/>
+          <w:lang w:eastAsia="ja-JP"/>
+        </w:rPr>
+        <w:t>手法</w:t>
+      </w:r>
+      <w:r>
+        <w:rPr>
+          <w:lang w:eastAsia="ja-JP"/>
+        </w:rPr>
+        <w:t>「</w:t>
+      </w:r>
+      <w:r>
+        <w:rPr>
+          <w:lang w:eastAsia="ja-JP"/>
+        </w:rPr>
+        <w:t>k-means</w:t>
+      </w:r>
+      <w:r>
+        <w:rPr>
+          <w:lang w:eastAsia="ja-JP"/>
+        </w:rPr>
+        <w:t>法」の弱点を克服するために改良された、初期値設定のアルゴリズム</w:t>
+      </w:r>
+      <w:r>
+        <w:rPr>
+          <w:rFonts w:hint="eastAsia"/>
+          <w:lang w:eastAsia="ja-JP"/>
+        </w:rPr>
+        <w:t>のこと。現在、</w:t>
+      </w:r>
+      <w:r>
+        <w:rPr>
+          <w:lang w:eastAsia="ja-JP"/>
+        </w:rPr>
+        <w:t>クラスタリング</w:t>
+      </w:r>
+      <w:r>
+        <w:rPr>
+          <w:rFonts w:hint="eastAsia"/>
+          <w:lang w:eastAsia="ja-JP"/>
+        </w:rPr>
+        <w:t>手法</w:t>
+      </w:r>
+      <w:r>
+        <w:rPr>
+          <w:rFonts w:hint="eastAsia"/>
+          <w:lang w:eastAsia="ja-JP"/>
+        </w:rPr>
+        <w:t>として「</w:t>
+      </w:r>
+      <w:r>
+        <w:rPr>
+          <w:lang w:eastAsia="ja-JP"/>
+        </w:rPr>
+        <w:t>k-means</w:t>
+      </w:r>
+      <w:r>
+        <w:rPr>
+          <w:rFonts w:hint="eastAsia"/>
+          <w:lang w:eastAsia="ja-JP"/>
+        </w:rPr>
+        <w:t>」といえば、</w:t>
+      </w:r>
+      <w:r>
+        <w:rPr>
+          <w:lang w:eastAsia="ja-JP"/>
+        </w:rPr>
+        <w:t>k-means++</w:t>
+      </w:r>
+      <w:r>
+        <w:rPr>
+          <w:rFonts w:hint="eastAsia"/>
+          <w:lang w:eastAsia="ja-JP"/>
+        </w:rPr>
+        <w:t>を使った改良版を指すが、</w:t>
+      </w:r>
+      <w:r>
+        <w:rPr>
+          <w:rFonts w:hint="eastAsia"/>
+          <w:lang w:eastAsia="ja-JP"/>
+        </w:rPr>
+        <w:t>AI</w:t>
+      </w:r>
+      <w:r>
+        <w:rPr>
+          <w:rFonts w:hint="eastAsia"/>
+          <w:lang w:eastAsia="ja-JP"/>
+        </w:rPr>
+        <w:t>がオリジナルの</w:t>
+      </w:r>
+      <w:r>
+        <w:rPr>
+          <w:lang w:eastAsia="ja-JP"/>
+        </w:rPr>
+        <w:t>k-means</w:t>
+      </w:r>
+      <w:r>
+        <w:rPr>
+          <w:rFonts w:hint="eastAsia"/>
+          <w:lang w:eastAsia="ja-JP"/>
+        </w:rPr>
+        <w:t>を使わないよう、</w:t>
+      </w:r>
+      <w:r>
+        <w:rPr>
+          <w:lang w:eastAsia="ja-JP"/>
+        </w:rPr>
+        <w:t>k-means++</w:t>
+      </w:r>
+      <w:r>
+        <w:rPr>
+          <w:rFonts w:hint="eastAsia"/>
+          <w:lang w:eastAsia="ja-JP"/>
+        </w:rPr>
+        <w:t>とあえて指定している。</w:t>
+      </w:r>
+    </w:p>
+  </w:footnote>
+  <w:footnote w:id="16">
+    <w:p>
+      <w:pPr>
+        <w:pStyle w:val="ab"/>
+        <w:rPr>
+          <w:rFonts w:hint="eastAsia"/>
+          <w:lang w:eastAsia="ja-JP"/>
+        </w:rPr>
+      </w:pPr>
+      <w:r>
+        <w:rPr>
+          <w:rStyle w:val="ae"/>
+        </w:rPr>
+        <w:footnoteRef/>
+      </w:r>
+      <w:r>
+        <w:rPr>
+          <w:lang w:eastAsia="ja-JP"/>
+        </w:rPr>
+        <w:t xml:space="preserve"> </w:t>
+      </w:r>
+      <w:r>
+        <w:rPr>
+          <w:lang w:eastAsia="ja-JP"/>
+        </w:rPr>
+        <w:t>データの「密度」に基づいてクラスタリング</w:t>
+      </w:r>
+      <w:r>
+        <w:rPr>
+          <w:rFonts w:hint="eastAsia"/>
+          <w:lang w:eastAsia="ja-JP"/>
+        </w:rPr>
+        <w:t>する</w:t>
+      </w:r>
+      <w:r>
+        <w:rPr>
+          <w:lang w:eastAsia="ja-JP"/>
+        </w:rPr>
+        <w:t>アルゴリズム</w:t>
+      </w:r>
+      <w:r>
+        <w:rPr>
+          <w:rFonts w:hint="eastAsia"/>
+          <w:lang w:eastAsia="ja-JP"/>
+        </w:rPr>
+        <w:t>。</w:t>
+      </w:r>
+    </w:p>
+  </w:footnote>
+  <w:footnote w:id="17">
+    <w:p>
+      <w:pPr>
+        <w:pStyle w:val="ab"/>
+        <w:rPr>
+          <w:rFonts w:hint="eastAsia"/>
+          <w:lang w:eastAsia="ja-JP"/>
+        </w:rPr>
+      </w:pPr>
+      <w:r>
+        <w:rPr>
+          <w:rStyle w:val="ae"/>
+        </w:rPr>
+        <w:footnoteRef/>
+      </w:r>
+      <w:r>
+        <w:t xml:space="preserve"> </w:t>
+      </w:r>
+      <w:r>
+        <w:rPr>
+          <w:rFonts w:hint="eastAsia"/>
+          <w:lang w:eastAsia="ja-JP"/>
+        </w:rPr>
+        <w:t>あるテキストを端的に表す短いテキストのこと。</w:t>
+      </w:r>
+    </w:p>
+  </w:footnote>
+  <w:footnote w:id="18">
+    <w:p>
+      <w:pPr>
+        <w:pStyle w:val="ab"/>
+        <w:rPr>
+          <w:rFonts w:hint="eastAsia"/>
+          <w:lang w:eastAsia="ja-JP"/>
+        </w:rPr>
+      </w:pPr>
+      <w:r>
+        <w:rPr>
+          <w:rStyle w:val="ae"/>
+        </w:rPr>
+        <w:footnoteRef/>
+      </w:r>
+      <w:r>
+        <w:rPr>
+          <w:lang w:eastAsia="ja-JP"/>
+        </w:rPr>
+        <w:t xml:space="preserve"> </w:t>
+      </w:r>
+      <w:r>
+        <w:rPr>
+          <w:lang w:eastAsia="ja-JP"/>
+        </w:rPr>
+        <w:t>Xcode</w:t>
+      </w:r>
+      <w:r>
+        <w:rPr>
+          <w:lang w:eastAsia="ja-JP"/>
+        </w:rPr>
+        <w:t>プロジェクトのビルド、テスト、解析、アーカイブなどの操作をコマンドライン（ターミナル）から実行するためのツール</w:t>
+      </w:r>
+      <w:r>
+        <w:rPr>
+          <w:rFonts w:hint="eastAsia"/>
+          <w:lang w:eastAsia="ja-JP"/>
+        </w:rPr>
+        <w:t>のこと。</w:t>
+      </w:r>
+    </w:p>
+  </w:footnote>
+  <w:footnote w:id="19">
+    <w:p>
+      <w:pPr>
+        <w:pStyle w:val="ab"/>
+        <w:rPr>
+          <w:rFonts w:hint="eastAsia"/>
+          <w:lang w:eastAsia="ja-JP"/>
+        </w:rPr>
+      </w:pPr>
+      <w:r>
+        <w:rPr>
+          <w:rStyle w:val="ae"/>
+        </w:rPr>
+        <w:footnoteRef/>
+      </w:r>
+      <w:r>
+        <w:rPr>
+          <w:lang w:eastAsia="ja-JP"/>
+        </w:rPr>
+        <w:t xml:space="preserve"> </w:t>
+      </w:r>
+      <w:r>
+        <w:rPr>
+          <w:lang w:eastAsia="ja-JP"/>
+        </w:rPr>
+        <w:t>iPhone</w:t>
+      </w:r>
+      <w:r>
+        <w:rPr>
+          <w:lang w:eastAsia="ja-JP"/>
+        </w:rPr>
+        <w:t>、</w:t>
+      </w:r>
+      <w:r>
+        <w:rPr>
+          <w:lang w:eastAsia="ja-JP"/>
+        </w:rPr>
+        <w:t>iPad</w:t>
+      </w:r>
+      <w:r>
+        <w:rPr>
+          <w:lang w:eastAsia="ja-JP"/>
+        </w:rPr>
+        <w:t>、</w:t>
+      </w:r>
+      <w:r>
+        <w:rPr>
+          <w:lang w:eastAsia="ja-JP"/>
+        </w:rPr>
+        <w:t>Mac</w:t>
+      </w:r>
+      <w:r>
+        <w:rPr>
+          <w:lang w:eastAsia="ja-JP"/>
+        </w:rPr>
+        <w:t>、</w:t>
+      </w:r>
+      <w:r>
+        <w:rPr>
+          <w:lang w:eastAsia="ja-JP"/>
+        </w:rPr>
+        <w:t>Apple Watch</w:t>
+      </w:r>
+      <w:r>
+        <w:rPr>
+          <w:lang w:eastAsia="ja-JP"/>
+        </w:rPr>
+        <w:t>、</w:t>
+      </w:r>
+      <w:r>
+        <w:rPr>
+          <w:lang w:eastAsia="ja-JP"/>
+        </w:rPr>
+        <w:t>Apple TV</w:t>
+      </w:r>
+      <w:r>
+        <w:rPr>
+          <w:lang w:eastAsia="ja-JP"/>
+        </w:rPr>
+        <w:t>向けのアプリを開発し、</w:t>
+      </w:r>
+      <w:r>
+        <w:rPr>
+          <w:lang w:eastAsia="ja-JP"/>
+        </w:rPr>
+        <w:t>App Store</w:t>
+      </w:r>
+      <w:r>
+        <w:rPr>
+          <w:lang w:eastAsia="ja-JP"/>
+        </w:rPr>
+        <w:t>で公開するために必要な公式の年間メンバーシップ</w:t>
+      </w:r>
+      <w:r>
+        <w:rPr>
+          <w:rFonts w:hint="eastAsia"/>
+          <w:lang w:eastAsia="ja-JP"/>
+        </w:rPr>
+        <w:t>のこと。</w:t>
+      </w:r>
+    </w:p>
+  </w:footnote>
+  <w:footnote w:id="20">
+    <w:p>
+      <w:pPr>
+        <w:pStyle w:val="ab"/>
+        <w:rPr>
+          <w:rFonts w:hint="eastAsia"/>
+          <w:lang w:eastAsia="ja-JP"/>
+        </w:rPr>
+      </w:pPr>
+      <w:r>
+        <w:rPr>
+          <w:rStyle w:val="ae"/>
+        </w:rPr>
+        <w:footnoteRef/>
+      </w:r>
+      <w:r>
+        <w:rPr>
+          <w:lang w:eastAsia="ja-JP"/>
+        </w:rPr>
+        <w:t xml:space="preserve"> </w:t>
+      </w:r>
+      <w:r>
+        <w:rPr>
+          <w:rFonts w:hint="eastAsia"/>
+          <w:lang w:eastAsia="ja-JP"/>
+        </w:rPr>
+        <w:t>LLM</w:t>
+      </w:r>
+      <w:r>
+        <w:rPr>
+          <w:rFonts w:hint="eastAsia"/>
+          <w:lang w:eastAsia="ja-JP"/>
+        </w:rPr>
+        <w:t>に投入するデータのサイズのこと。</w:t>
+      </w:r>
+    </w:p>
+  </w:footnote>
+  <w:footnote w:id="21">
+    <w:p>
+      <w:pPr>
+        <w:pStyle w:val="ab"/>
+        <w:rPr>
+          <w:rFonts w:hint="eastAsia"/>
+          <w:lang w:eastAsia="ja-JP"/>
+        </w:rPr>
+      </w:pPr>
+      <w:r>
+        <w:rPr>
+          <w:rStyle w:val="ae"/>
+        </w:rPr>
+        <w:footnoteRef/>
+      </w:r>
+      <w:r>
+        <w:rPr>
+          <w:lang w:eastAsia="ja-JP"/>
+        </w:rPr>
+        <w:t xml:space="preserve"> OpenAI</w:t>
+      </w:r>
+      <w:r>
+        <w:rPr>
+          <w:rFonts w:hint="eastAsia"/>
+          <w:lang w:eastAsia="ja-JP"/>
+        </w:rPr>
+        <w:t>の場合、通常の上限は</w:t>
+      </w:r>
+      <w:r>
+        <w:rPr>
+          <w:rFonts w:hint="eastAsia"/>
+          <w:lang w:eastAsia="ja-JP"/>
+        </w:rPr>
+        <w:t>128</w:t>
+      </w:r>
+      <w:r>
+        <w:rPr>
+          <w:lang w:eastAsia="ja-JP"/>
+        </w:rPr>
+        <w:t>K</w:t>
+      </w:r>
+      <w:r>
+        <w:rPr>
+          <w:rFonts w:hint="eastAsia"/>
+          <w:lang w:eastAsia="ja-JP"/>
+        </w:rPr>
+        <w:t>だが、コストを抑えるため</w:t>
+      </w:r>
+      <w:r>
+        <w:rPr>
+          <w:rFonts w:hint="eastAsia"/>
+          <w:lang w:eastAsia="ja-JP"/>
+        </w:rPr>
+        <w:t>8K</w:t>
+      </w:r>
+      <w:r>
+        <w:rPr>
+          <w:rFonts w:hint="eastAsia"/>
+          <w:lang w:eastAsia="ja-JP"/>
+        </w:rPr>
+        <w:t>にしている。</w:t>
+      </w:r>
+    </w:p>
+  </w:footnote>
+  <w:footnote w:id="22">
+    <w:p>
+      <w:pPr>
+        <w:pStyle w:val="ab"/>
+        <w:rPr>
+          <w:rFonts w:hint="eastAsia"/>
+          <w:lang w:eastAsia="ja-JP"/>
+        </w:rPr>
+      </w:pPr>
+      <w:r>
+        <w:rPr>
+          <w:rStyle w:val="ae"/>
+        </w:rPr>
+        <w:footnoteRef/>
+      </w:r>
+      <w:r>
+        <w:rPr>
+          <w:lang w:eastAsia="ja-JP"/>
+        </w:rPr>
+        <w:t xml:space="preserve"> </w:t>
+      </w:r>
+      <w:r>
+        <w:rPr>
+          <w:rFonts w:hint="eastAsia"/>
+          <w:lang w:eastAsia="ja-JP"/>
+        </w:rPr>
+        <w:t>MacOS</w:t>
+      </w:r>
+      <w:r>
+        <w:rPr>
+          <w:rFonts w:hint="eastAsia"/>
+          <w:lang w:eastAsia="ja-JP"/>
+        </w:rPr>
+        <w:t>には</w:t>
+      </w:r>
+      <w:r>
+        <w:rPr>
+          <w:lang w:eastAsia="ja-JP"/>
+        </w:rPr>
+        <w:t>信頼できないソフトウェア</w:t>
+      </w:r>
+      <w:r>
+        <w:rPr>
+          <w:rFonts w:hint="eastAsia"/>
+          <w:lang w:eastAsia="ja-JP"/>
+        </w:rPr>
+        <w:t>の</w:t>
+      </w:r>
+      <w:r>
+        <w:rPr>
+          <w:lang w:eastAsia="ja-JP"/>
+        </w:rPr>
+        <w:t>実行を防ぐ</w:t>
+      </w:r>
+      <w:r>
+        <w:rPr>
+          <w:lang w:eastAsia="ja-JP"/>
+        </w:rPr>
+        <w:t>Gatekeeper</w:t>
+      </w:r>
+      <w:r>
+        <w:rPr>
+          <w:rFonts w:hint="eastAsia"/>
+          <w:lang w:eastAsia="ja-JP"/>
+        </w:rPr>
+        <w:t>という仕組みがある。開発者が自作アプリに</w:t>
+      </w:r>
+      <w:r>
+        <w:rPr>
+          <w:rFonts w:hint="eastAsia"/>
+          <w:lang w:eastAsia="ja-JP"/>
+        </w:rPr>
+        <w:t>Apple ID</w:t>
+      </w:r>
+      <w:r>
+        <w:rPr>
+          <w:rFonts w:hint="eastAsia"/>
+          <w:lang w:eastAsia="ja-JP"/>
+        </w:rPr>
+        <w:t>で署名すれば、誰が作ったのが判明するのでインターネットからダウンロードしたアプリでも</w:t>
+      </w:r>
+      <w:r>
+        <w:rPr>
+          <w:lang w:eastAsia="ja-JP"/>
+        </w:rPr>
+        <w:t>Gatekeeper</w:t>
+      </w:r>
+      <w:r>
+        <w:rPr>
+          <w:rFonts w:hint="eastAsia"/>
+          <w:lang w:eastAsia="ja-JP"/>
+        </w:rPr>
+        <w:t>に阻止されずに実行できる。</w:t>
+      </w:r>
+    </w:p>
+  </w:footnote>
+  <w:footnote w:id="23">
+    <w:p>
+      <w:pPr>
+        <w:pStyle w:val="ab"/>
+        <w:rPr>
+          <w:rFonts w:hint="eastAsia"/>
+          <w:lang w:eastAsia="ja-JP"/>
+        </w:rPr>
+      </w:pPr>
+      <w:r>
+        <w:rPr>
+          <w:rStyle w:val="ae"/>
+        </w:rPr>
+        <w:footnoteRef/>
+      </w:r>
+      <w:r>
+        <w:rPr>
+          <w:lang w:eastAsia="ja-JP"/>
+        </w:rPr>
+        <w:t>高次元</w:t>
+      </w:r>
+      <w:r>
+        <w:rPr>
+          <w:rFonts w:hint="eastAsia"/>
+          <w:lang w:eastAsia="ja-JP"/>
+        </w:rPr>
+        <w:t>ベクトル</w:t>
+      </w:r>
+      <w:r>
+        <w:rPr>
+          <w:lang w:eastAsia="ja-JP"/>
+        </w:rPr>
+        <w:t>を、その特徴を保ったまま</w:t>
+      </w:r>
+      <w:r>
+        <w:rPr>
+          <w:lang w:eastAsia="ja-JP"/>
+        </w:rPr>
+        <w:t>2</w:t>
+      </w:r>
+      <w:r>
+        <w:rPr>
+          <w:lang w:eastAsia="ja-JP"/>
+        </w:rPr>
+        <w:t>次元や</w:t>
+      </w:r>
+      <w:r>
+        <w:rPr>
+          <w:lang w:eastAsia="ja-JP"/>
+        </w:rPr>
+        <w:t>3</w:t>
+      </w:r>
+      <w:r>
+        <w:rPr>
+          <w:lang w:eastAsia="ja-JP"/>
+        </w:rPr>
+        <w:t>次元の低い次元に落とし込む（次元圧縮）ためのアルゴリズム</w:t>
+      </w:r>
+      <w:r>
+        <w:rPr>
+          <w:rFonts w:hint="eastAsia"/>
+          <w:lang w:eastAsia="ja-JP"/>
+        </w:rPr>
+        <w:t>のこと。</w:t>
+      </w:r>
+    </w:p>
+  </w:footnote>
+  <w:footnote w:id="24">
+    <w:p>
+      <w:pPr>
+        <w:pStyle w:val="ab"/>
+        <w:rPr>
+          <w:rFonts w:hint="eastAsia"/>
+          <w:lang w:eastAsia="ja-JP"/>
+        </w:rPr>
+      </w:pPr>
+      <w:r>
+        <w:rPr>
+          <w:rStyle w:val="ae"/>
+        </w:rPr>
+        <w:footnoteRef/>
+      </w:r>
+      <w:r>
+        <w:rPr>
+          <w:lang w:eastAsia="ja-JP"/>
+        </w:rPr>
+        <w:t xml:space="preserve"> </w:t>
+      </w:r>
+      <w:r>
+        <w:rPr>
+          <w:lang w:eastAsia="ja-JP"/>
+        </w:rPr>
+        <w:t>Mac App Store</w:t>
+      </w:r>
+      <w:r>
+        <w:rPr>
+          <w:lang w:eastAsia="ja-JP"/>
+        </w:rPr>
+        <w:t>以外で配布される</w:t>
+      </w:r>
+      <w:r>
+        <w:rPr>
+          <w:lang w:eastAsia="ja-JP"/>
+        </w:rPr>
+        <w:t>macOS</w:t>
+      </w:r>
+      <w:r>
+        <w:rPr>
+          <w:lang w:eastAsia="ja-JP"/>
+        </w:rPr>
+        <w:t>アプリが、「</w:t>
+      </w:r>
+      <w:r>
+        <w:rPr>
+          <w:lang w:eastAsia="ja-JP"/>
+        </w:rPr>
+        <w:t>Apple</w:t>
+      </w:r>
+      <w:r>
+        <w:rPr>
+          <w:lang w:eastAsia="ja-JP"/>
+        </w:rPr>
+        <w:t>によって既知のマルウェア（悪意のあるソフト）が含まれていないかスキャンされ、合格した」ことを証明するプロセス</w:t>
+      </w:r>
+      <w:r>
+        <w:rPr>
+          <w:rFonts w:hint="eastAsia"/>
+          <w:lang w:eastAsia="ja-JP"/>
+        </w:rPr>
+        <w:t>のこと。</w:t>
+      </w:r>
+    </w:p>
+  </w:footnote>
+  <w:footnote w:id="25">
+    <w:p>
+      <w:pPr>
+        <w:pStyle w:val="ab"/>
+        <w:rPr>
+          <w:rFonts w:hint="eastAsia"/>
+          <w:lang w:eastAsia="ja-JP"/>
+        </w:rPr>
+      </w:pPr>
+      <w:r>
+        <w:rPr>
+          <w:rStyle w:val="ae"/>
+        </w:rPr>
+        <w:footnoteRef/>
+      </w:r>
+      <w:r>
+        <w:t xml:space="preserve"> </w:t>
+      </w:r>
+      <w:r>
+        <w:rPr>
+          <w:rFonts w:hint="eastAsia"/>
+          <w:lang w:eastAsia="ja-JP"/>
+        </w:rPr>
+        <w:t>OpenAI</w:t>
+      </w:r>
+      <w:r>
+        <w:rPr>
+          <w:rFonts w:hint="eastAsia"/>
+          <w:lang w:eastAsia="ja-JP"/>
+        </w:rPr>
+        <w:t>の埋め込みモデル。</w:t>
+      </w:r>
+    </w:p>
+  </w:footnote>
+  <w:footnote w:id="26">
+    <w:p>
+      <w:pPr>
+        <w:pStyle w:val="ab"/>
+        <w:rPr>
+          <w:rFonts w:hint="eastAsia"/>
+          <w:lang w:eastAsia="ja-JP"/>
+        </w:rPr>
+      </w:pPr>
+      <w:r>
+        <w:rPr>
+          <w:rStyle w:val="ae"/>
+        </w:rPr>
+        <w:footnoteRef/>
+      </w:r>
+      <w:r>
+        <w:t xml:space="preserve"> </w:t>
+      </w:r>
+      <w:r>
+        <w:rPr>
+          <w:rFonts w:hint="eastAsia"/>
+          <w:lang w:eastAsia="ja-JP"/>
+        </w:rPr>
+        <w:t>OpenAI</w:t>
+      </w:r>
+      <w:r>
+        <w:rPr>
+          <w:rFonts w:hint="eastAsia"/>
+          <w:lang w:eastAsia="ja-JP"/>
+        </w:rPr>
+        <w:t>の生成</w:t>
+      </w:r>
+      <w:r>
+        <w:rPr>
+          <w:rFonts w:hint="eastAsia"/>
+          <w:lang w:eastAsia="ja-JP"/>
+        </w:rPr>
+        <w:t>AI</w:t>
+      </w:r>
+      <w:r>
+        <w:rPr>
+          <w:rFonts w:hint="eastAsia"/>
+          <w:lang w:eastAsia="ja-JP"/>
+        </w:rPr>
+        <w:t>モデル。</w:t>
+      </w:r>
+      <w:r>
+        <w:rPr>
+          <w:rFonts w:hint="eastAsia"/>
+          <w:lang w:eastAsia="ja-JP"/>
+        </w:rPr>
+        <w:t>推論なしで安価。</w:t>
+      </w:r>
+    </w:p>
+  </w:footnote>
+</w:footnotes>
 </file>
 
 <file path=word/numbering.xml><?xml version="1.0" encoding="utf-8"?>
@@ -6651,6 +8780,15 @@
       <w:color w:val="000000"/>
       <w:sz w:val="28"/>
       <w:szCs w:val="28"/>
+    </w:rPr>
+  </w:style>
+  <w:style w:type="character" w:styleId="afd">
+    <w:name w:val="FollowedHyperlink"/>
+    <w:basedOn w:val="a0"/>
+    <w:rsid w:val="002F147B"/>
+    <w:rPr>
+      <w:color w:val="96607D" w:themeColor="followedHyperlink"/>
+      <w:u w:val="single"/>
     </w:rPr>
   </w:style>
 </w:styles>
@@ -6949,4 +9087,16 @@
     </a:ext>
   </a:extLst>
 </a:theme>
+</file>
+
+<file path=customXml/item1.xml><?xml version="1.0" encoding="utf-8"?>
+<b:Sources xmlns:b="http://schemas.openxmlformats.org/officeDocument/2006/bibliography" xmlns="http://schemas.openxmlformats.org/officeDocument/2006/bibliography" SelectedStyle="/APASixthEditionOfficeOnline.xsl" StyleName="APA" Version="6"/>
+</file>
+
+<file path=customXml/itemProps1.xml><?xml version="1.0" encoding="utf-8"?>
+<ds:datastoreItem xmlns:ds="http://schemas.openxmlformats.org/officeDocument/2006/customXml" ds:itemID="{F081F662-BA9A-E34F-BFFE-DBBA4ACB6889}">
+  <ds:schemaRefs>
+    <ds:schemaRef ds:uri="http://schemas.openxmlformats.org/officeDocument/2006/bibliography"/>
+  </ds:schemaRefs>
+</ds:datastoreItem>
 </file>
</xml_diff>

<commit_message>
Update prompt history document and PDF
Co-Authored-By: Claude Opus 4.6 (1M context) <noreply@anthropic.com>
</commit_message>
<xml_diff>
--- a/Docs/仕様駆動開発 プロンプト履歴.docx
+++ b/Docs/仕様駆動開発 プロンプト履歴.docx
@@ -503,50 +503,50 @@
           <w:rFonts w:hint="eastAsia"/>
           <w:lang w:eastAsia="ja-JP"/>
         </w:rPr>
+        <w:t>形式ファイル（</w:t>
+      </w:r>
+      <w:r>
+        <w:rPr>
+          <w:rFonts w:hint="eastAsia"/>
+          <w:lang w:eastAsia="ja-JP"/>
+        </w:rPr>
+        <w:t>PDF</w:t>
+      </w:r>
+      <w:r>
+        <w:rPr>
+          <w:rFonts w:hint="eastAsia"/>
+          <w:lang w:eastAsia="ja-JP"/>
+        </w:rPr>
+        <w:t>不可）としてダウンロードできるようにしてください。ファイル名は先頭に連番（「</w:t>
+      </w:r>
+      <w:r>
+        <w:rPr>
+          <w:rFonts w:hint="eastAsia"/>
+          <w:lang w:eastAsia="ja-JP"/>
+        </w:rPr>
+        <w:t>002_CTO_Project_Planning_Review</w:t>
+      </w:r>
+      <w:r>
+        <w:rPr>
+          <w:rFonts w:hint="eastAsia"/>
+          <w:lang w:eastAsia="ja-JP"/>
+        </w:rPr>
+        <w:t>」など）を振ってください。なお、ファイルとは別に、私には要点を整理して応答してください。</w:t>
+      </w:r>
+    </w:p>
+    <w:p>
+      <w:pPr>
+        <w:pStyle w:val="a3"/>
+        <w:rPr>
+          <w:lang w:eastAsia="ja-JP"/>
+        </w:rPr>
+      </w:pPr>
+      <w:r>
+        <w:rPr>
+          <w:rFonts w:hint="eastAsia"/>
+          <w:lang w:eastAsia="ja-JP"/>
+        </w:rPr>
         <w:lastRenderedPageBreak/>
-        <w:t>形式ファイル（</w:t>
-      </w:r>
-      <w:r>
-        <w:rPr>
-          <w:rFonts w:hint="eastAsia"/>
-          <w:lang w:eastAsia="ja-JP"/>
-        </w:rPr>
-        <w:t>PDF</w:t>
-      </w:r>
-      <w:r>
-        <w:rPr>
-          <w:rFonts w:hint="eastAsia"/>
-          <w:lang w:eastAsia="ja-JP"/>
-        </w:rPr>
-        <w:t>不可）としてダウンロードできるようにしてください。ファイル名は先頭に連番（「</w:t>
-      </w:r>
-      <w:r>
-        <w:rPr>
-          <w:rFonts w:hint="eastAsia"/>
-          <w:lang w:eastAsia="ja-JP"/>
-        </w:rPr>
-        <w:t>002_CTO_Project_Planning_Review</w:t>
-      </w:r>
-      <w:r>
-        <w:rPr>
-          <w:rFonts w:hint="eastAsia"/>
-          <w:lang w:eastAsia="ja-JP"/>
-        </w:rPr>
-        <w:t>」など）を振ってください。なお、ファイルとは別に、私には要点を整理して応答してください。</w:t>
-      </w:r>
-    </w:p>
-    <w:p>
-      <w:pPr>
-        <w:pStyle w:val="a3"/>
-        <w:rPr>
-          <w:lang w:eastAsia="ja-JP"/>
-        </w:rPr>
-      </w:pPr>
-      <w:r>
-        <w:rPr>
-          <w:rFonts w:hint="eastAsia"/>
-          <w:lang w:eastAsia="ja-JP"/>
-        </w:rPr>
         <w:t>さて、</w:t>
       </w:r>
       <w:r>
@@ -726,9 +726,15 @@
     <w:p>
       <w:pPr>
         <w:pStyle w:val="3"/>
+        <w:rPr>
+          <w:lang w:eastAsia="ja-JP"/>
+        </w:rPr>
       </w:pPr>
       <w:bookmarkStart w:id="8" w:name="chatgpt-1"/>
       <w:r>
+        <w:rPr>
+          <w:lang w:eastAsia="ja-JP"/>
+        </w:rPr>
         <w:t>ChatGPT</w:t>
       </w:r>
     </w:p>
@@ -742,6 +748,7 @@
       <w:r>
         <w:rPr>
           <w:rFonts w:hint="eastAsia"/>
+          <w:lang w:eastAsia="ja-JP"/>
         </w:rPr>
         <w:t>上級エンジニアからの回答です</w:t>
       </w:r>
@@ -751,6 +758,9 @@
         <w:pStyle w:val="FirstParagraph"/>
       </w:pPr>
       <w:r>
+        <w:rPr>
+          <w:lang w:eastAsia="ja-JP"/>
+        </w:rPr>
         <w:t xml:space="preserve"> </w:t>
       </w:r>
       <w:hyperlink r:id="rId11">
@@ -758,19 +768,7 @@
           <w:rPr>
             <w:rStyle w:val="af"/>
           </w:rPr>
-          <w:t>002_Engineer_Review_of_Project_Pl</w:t>
-        </w:r>
-        <w:r>
-          <w:rPr>
-            <w:rStyle w:val="af"/>
-          </w:rPr>
-          <w:t>a</w:t>
-        </w:r>
-        <w:r>
-          <w:rPr>
-            <w:rStyle w:val="af"/>
-          </w:rPr>
-          <w:t>nning.md</w:t>
+          <w:t>002_Engineer_Review_of_Project_Planning.md</w:t>
         </w:r>
       </w:hyperlink>
     </w:p>
@@ -784,15 +782,9 @@
       <w:r>
         <w:rPr>
           <w:rFonts w:hint="eastAsia"/>
-        </w:rPr>
-        <w:t>上級エンジニアが工程について同意したので、構想フェイズに入りましょう。</w:t>
-      </w:r>
-      <w:r>
-        <w:rPr>
-          <w:rFonts w:hint="eastAsia"/>
-          <w:lang w:eastAsia="ja-JP"/>
-        </w:rPr>
-        <w:t>以下は、今回のプロジェクトの目的と概要です。上級エンジニアには、構想段階の懸念事項があれば指摘してほしいと伝えてください。ただし、技術スタック</w:t>
+          <w:lang w:eastAsia="ja-JP"/>
+        </w:rPr>
+        <w:t>上級エンジニアが工程について同意したので、構想フェイズに入りましょう。以下は、今回のプロジェクトの目的と概要です。上級エンジニアには、構想段階の懸念事項があれば指摘してほしいと伝えてください。ただし、技術スタック</w:t>
       </w:r>
       <w:r>
         <w:rPr>
@@ -998,7 +990,6 @@
           <w:rFonts w:hint="eastAsia"/>
           <w:lang w:eastAsia="ja-JP"/>
         </w:rPr>
-        <w:lastRenderedPageBreak/>
         <w:t>電話応対履歴のサンプルは以下にある、と伝えましょう。</w:t>
       </w:r>
     </w:p>
@@ -1062,6 +1053,7 @@
           <w:rFonts w:hint="eastAsia"/>
           <w:lang w:eastAsia="ja-JP"/>
         </w:rPr>
+        <w:lastRenderedPageBreak/>
         <w:t>実装以降のフェーズが未定義</w:t>
       </w:r>
       <w:r>
@@ -1517,61 +1509,61 @@
           <w:rFonts w:hint="eastAsia"/>
           <w:lang w:eastAsia="ja-JP"/>
         </w:rPr>
+        <w:t>デモとしての伝達力にコメントがついています。この点については、</w:t>
+      </w:r>
+      <w:r>
+        <w:rPr>
+          <w:rFonts w:hint="eastAsia"/>
+          <w:lang w:eastAsia="ja-JP"/>
+        </w:rPr>
+        <w:t>3D</w:t>
+      </w:r>
+      <w:r>
+        <w:rPr>
+          <w:rFonts w:hint="eastAsia"/>
+          <w:lang w:eastAsia="ja-JP"/>
+        </w:rPr>
+        <w:t>散布図を描くことで、デモ参加者に驚いてもらうのはどうかと思っています。</w:t>
+      </w:r>
+    </w:p>
+    <w:p>
+      <w:pPr>
+        <w:pStyle w:val="a3"/>
+        <w:rPr>
+          <w:lang w:eastAsia="ja-JP"/>
+        </w:rPr>
+      </w:pPr>
+      <w:r>
+        <w:rPr>
+          <w:rFonts w:hint="eastAsia"/>
+          <w:lang w:eastAsia="ja-JP"/>
+        </w:rPr>
+        <w:t>さて、以下は仕様について検討していることです。</w:t>
+      </w:r>
+      <w:r>
+        <w:rPr>
+          <w:rFonts w:hint="eastAsia"/>
+          <w:lang w:eastAsia="ja-JP"/>
+        </w:rPr>
+        <w:t>CTO</w:t>
+      </w:r>
+      <w:r>
+        <w:rPr>
+          <w:rFonts w:hint="eastAsia"/>
+          <w:lang w:eastAsia="ja-JP"/>
+        </w:rPr>
+        <w:t>補佐として、上級エンジニアの理解がスムーズになるよう、必要なら私にフィードバックしてください。わたしとあなたで合意したことを上級エンジニアに伝えましょう。</w:t>
+      </w:r>
+    </w:p>
+    <w:p>
+      <w:pPr>
+        <w:pStyle w:val="a3"/>
+      </w:pPr>
+      <w:r>
+        <w:rPr>
+          <w:rFonts w:hint="eastAsia"/>
+        </w:rPr>
         <w:lastRenderedPageBreak/>
-        <w:t>デモとしての伝達力にコメントがついています。この点については、</w:t>
-      </w:r>
-      <w:r>
-        <w:rPr>
-          <w:rFonts w:hint="eastAsia"/>
-          <w:lang w:eastAsia="ja-JP"/>
-        </w:rPr>
-        <w:t>3D</w:t>
-      </w:r>
-      <w:r>
-        <w:rPr>
-          <w:rFonts w:hint="eastAsia"/>
-          <w:lang w:eastAsia="ja-JP"/>
-        </w:rPr>
-        <w:t>散布図を描くことで、デモ参加者に驚いてもらうのはどうかと思っています。</w:t>
-      </w:r>
-    </w:p>
-    <w:p>
-      <w:pPr>
-        <w:pStyle w:val="a3"/>
-        <w:rPr>
-          <w:lang w:eastAsia="ja-JP"/>
-        </w:rPr>
-      </w:pPr>
-      <w:r>
-        <w:rPr>
-          <w:rFonts w:hint="eastAsia"/>
-          <w:lang w:eastAsia="ja-JP"/>
-        </w:rPr>
-        <w:t>さて、以下は仕様について検討していることです。</w:t>
-      </w:r>
-      <w:r>
-        <w:rPr>
-          <w:rFonts w:hint="eastAsia"/>
-          <w:lang w:eastAsia="ja-JP"/>
-        </w:rPr>
-        <w:t>CTO</w:t>
-      </w:r>
-      <w:r>
-        <w:rPr>
-          <w:rFonts w:hint="eastAsia"/>
-          <w:lang w:eastAsia="ja-JP"/>
-        </w:rPr>
-        <w:t>補佐として、上級エンジニアの理解がスムーズになるよう、必要なら私にフィードバックしてください。わたしとあなたで合意したことを上級エンジニアに伝えましょう。</w:t>
-      </w:r>
-    </w:p>
-    <w:p>
-      <w:pPr>
-        <w:pStyle w:val="a3"/>
-      </w:pPr>
-      <w:r>
-        <w:rPr>
-          <w:rFonts w:hint="eastAsia"/>
-        </w:rPr>
         <w:t>技術スタック：</w:t>
       </w:r>
     </w:p>
@@ -1972,7 +1964,6 @@
         <w:rPr>
           <w:lang w:eastAsia="ja-JP"/>
         </w:rPr>
-        <w:lastRenderedPageBreak/>
         <w:t xml:space="preserve">macOS </w:t>
       </w:r>
       <w:r>
@@ -2286,7 +2277,15 @@
           <w:rFonts w:hint="eastAsia"/>
           <w:lang w:eastAsia="ja-JP"/>
         </w:rPr>
-        <w:t>「分析」メニューアイテムがあり、選択すると分析ダイアログが登場する。「埋め込み」タブでは、メインウィンドウに表示中のデータセットの列リストから埋め込み対象を選び、設定画面で登録した埋め込みモデルで埋め込みを算出できる。「クラスタリング</w:t>
+        <w:t>「分析」メニューアイテムがあり、選択</w:t>
+      </w:r>
+      <w:r>
+        <w:rPr>
+          <w:rFonts w:hint="eastAsia"/>
+          <w:lang w:eastAsia="ja-JP"/>
+        </w:rPr>
+        <w:lastRenderedPageBreak/>
+        <w:t>すると分析ダイアログが登場する。「埋め込み」タブでは、メインウィンドウに表示中のデータセットの列リストから埋め込み対象を選び、設定画面で登録した埋め込みモデルで埋め込みを算出できる。「クラスタリング</w:t>
       </w:r>
       <w:r>
         <w:rPr>
@@ -2545,133 +2544,133 @@
           <w:rFonts w:hint="eastAsia"/>
           <w:lang w:eastAsia="ja-JP"/>
         </w:rPr>
+        <w:t>CTO</w:t>
+      </w:r>
+      <w:r>
+        <w:rPr>
+          <w:rFonts w:hint="eastAsia"/>
+          <w:lang w:eastAsia="ja-JP"/>
+        </w:rPr>
+        <w:t>補佐からの仕様上の論点について、以下のように検討しました。</w:t>
+      </w:r>
+    </w:p>
+    <w:p>
+      <w:pPr>
+        <w:pStyle w:val="a3"/>
+        <w:rPr>
+          <w:lang w:eastAsia="ja-JP"/>
+        </w:rPr>
+      </w:pPr>
+      <w:r>
+        <w:rPr>
+          <w:rFonts w:hint="eastAsia"/>
+          <w:lang w:eastAsia="ja-JP"/>
+        </w:rPr>
+        <w:t>ローカル実行で完結することを、どの仕様で担保するか</w:t>
+      </w:r>
+      <w:r>
+        <w:rPr>
+          <w:lang w:eastAsia="ja-JP"/>
+        </w:rPr>
+        <w:t xml:space="preserve"> </w:t>
+      </w:r>
+      <w:r>
+        <w:rPr>
+          <w:rFonts w:hint="eastAsia"/>
+          <w:lang w:eastAsia="ja-JP"/>
+        </w:rPr>
+        <w:t>→</w:t>
+      </w:r>
+      <w:r>
+        <w:rPr>
+          <w:rFonts w:hint="eastAsia"/>
+          <w:lang w:eastAsia="ja-JP"/>
+        </w:rPr>
+        <w:t>xcodebuild</w:t>
+      </w:r>
+      <w:r>
+        <w:rPr>
+          <w:rStyle w:val="ae"/>
+          <w:lang w:eastAsia="ja-JP"/>
+        </w:rPr>
+        <w:footnoteReference w:id="18"/>
+      </w:r>
+      <w:r>
+        <w:rPr>
+          <w:rFonts w:hint="eastAsia"/>
+          <w:lang w:eastAsia="ja-JP"/>
+        </w:rPr>
+        <w:t>で</w:t>
+      </w:r>
+      <w:r>
+        <w:rPr>
+          <w:rFonts w:hint="eastAsia"/>
+          <w:lang w:eastAsia="ja-JP"/>
+        </w:rPr>
+        <w:t>.app</w:t>
+      </w:r>
+      <w:r>
+        <w:rPr>
+          <w:rFonts w:hint="eastAsia"/>
+          <w:lang w:eastAsia="ja-JP"/>
+        </w:rPr>
+        <w:t>ファイルを作成し、社内で配布可能とし、各自の</w:t>
+      </w:r>
+      <w:r>
+        <w:rPr>
+          <w:rFonts w:hint="eastAsia"/>
+          <w:lang w:eastAsia="ja-JP"/>
+        </w:rPr>
+        <w:t>Mac</w:t>
+      </w:r>
+      <w:r>
+        <w:rPr>
+          <w:rFonts w:hint="eastAsia"/>
+          <w:lang w:eastAsia="ja-JP"/>
+        </w:rPr>
+        <w:t>で実行できることを要件にします。</w:t>
+      </w:r>
+      <w:r>
+        <w:rPr>
+          <w:lang w:eastAsia="ja-JP"/>
+        </w:rPr>
+        <w:t xml:space="preserve"> Apple Developer </w:t>
+      </w:r>
+      <w:r>
+        <w:rPr>
+          <w:rFonts w:hint="eastAsia"/>
+          <w:lang w:eastAsia="ja-JP"/>
+        </w:rPr>
+        <w:t>Program</w:t>
+      </w:r>
+      <w:r>
+        <w:rPr>
+          <w:rStyle w:val="ae"/>
+          <w:lang w:eastAsia="ja-JP"/>
+        </w:rPr>
+        <w:footnoteReference w:id="19"/>
+      </w:r>
+      <w:r>
+        <w:rPr>
+          <w:rFonts w:hint="eastAsia"/>
+          <w:lang w:eastAsia="ja-JP"/>
+        </w:rPr>
+        <w:t>には加入済みです。</w:t>
+      </w:r>
+    </w:p>
+    <w:p>
+      <w:pPr>
+        <w:pStyle w:val="a3"/>
+        <w:rPr>
+          <w:lang w:eastAsia="ja-JP"/>
+        </w:rPr>
+      </w:pPr>
+      <w:r>
+        <w:rPr>
+          <w:rFonts w:hint="eastAsia"/>
+          <w:lang w:eastAsia="ja-JP"/>
+        </w:rPr>
         <w:lastRenderedPageBreak/>
-        <w:t>CTO</w:t>
-      </w:r>
-      <w:r>
-        <w:rPr>
-          <w:rFonts w:hint="eastAsia"/>
-          <w:lang w:eastAsia="ja-JP"/>
-        </w:rPr>
-        <w:t>補佐からの仕様上の論点について、以下のように検討しました。</w:t>
-      </w:r>
-    </w:p>
-    <w:p>
-      <w:pPr>
-        <w:pStyle w:val="a3"/>
-        <w:rPr>
-          <w:lang w:eastAsia="ja-JP"/>
-        </w:rPr>
-      </w:pPr>
-      <w:r>
-        <w:rPr>
-          <w:rFonts w:hint="eastAsia"/>
-          <w:lang w:eastAsia="ja-JP"/>
-        </w:rPr>
-        <w:t>ローカル実行で完結することを、どの仕様で担保するか</w:t>
-      </w:r>
-      <w:r>
-        <w:rPr>
-          <w:lang w:eastAsia="ja-JP"/>
-        </w:rPr>
-        <w:t xml:space="preserve"> </w:t>
-      </w:r>
-      <w:r>
-        <w:rPr>
-          <w:rFonts w:hint="eastAsia"/>
-          <w:lang w:eastAsia="ja-JP"/>
-        </w:rPr>
-        <w:t>→</w:t>
-      </w:r>
-      <w:r>
-        <w:rPr>
-          <w:rFonts w:hint="eastAsia"/>
-          <w:lang w:eastAsia="ja-JP"/>
-        </w:rPr>
-        <w:t>xcodebuild</w:t>
-      </w:r>
-      <w:r>
-        <w:rPr>
-          <w:rStyle w:val="ae"/>
-          <w:lang w:eastAsia="ja-JP"/>
-        </w:rPr>
-        <w:footnoteReference w:id="18"/>
-      </w:r>
-      <w:r>
-        <w:rPr>
-          <w:rFonts w:hint="eastAsia"/>
-          <w:lang w:eastAsia="ja-JP"/>
-        </w:rPr>
-        <w:t>で</w:t>
-      </w:r>
-      <w:r>
-        <w:rPr>
-          <w:rFonts w:hint="eastAsia"/>
-          <w:lang w:eastAsia="ja-JP"/>
-        </w:rPr>
-        <w:t>.app</w:t>
-      </w:r>
-      <w:r>
-        <w:rPr>
-          <w:rFonts w:hint="eastAsia"/>
-          <w:lang w:eastAsia="ja-JP"/>
-        </w:rPr>
-        <w:t>ファイルを作成し、社内で配布可能とし、各自の</w:t>
-      </w:r>
-      <w:r>
-        <w:rPr>
-          <w:rFonts w:hint="eastAsia"/>
-          <w:lang w:eastAsia="ja-JP"/>
-        </w:rPr>
-        <w:t>Mac</w:t>
-      </w:r>
-      <w:r>
-        <w:rPr>
-          <w:rFonts w:hint="eastAsia"/>
-          <w:lang w:eastAsia="ja-JP"/>
-        </w:rPr>
-        <w:t>で実行できることを要件にします。</w:t>
-      </w:r>
-      <w:r>
-        <w:rPr>
-          <w:lang w:eastAsia="ja-JP"/>
-        </w:rPr>
-        <w:t xml:space="preserve"> Apple Developer </w:t>
-      </w:r>
-      <w:r>
-        <w:rPr>
-          <w:rFonts w:hint="eastAsia"/>
-          <w:lang w:eastAsia="ja-JP"/>
-        </w:rPr>
-        <w:t>Program</w:t>
-      </w:r>
-      <w:r>
-        <w:rPr>
-          <w:rStyle w:val="ae"/>
-          <w:lang w:eastAsia="ja-JP"/>
-        </w:rPr>
-        <w:footnoteReference w:id="19"/>
-      </w:r>
-      <w:r>
-        <w:rPr>
-          <w:rFonts w:hint="eastAsia"/>
-          <w:lang w:eastAsia="ja-JP"/>
-        </w:rPr>
-        <w:t>には加入済みです。</w:t>
-      </w:r>
-    </w:p>
-    <w:p>
-      <w:pPr>
-        <w:pStyle w:val="a3"/>
-        <w:rPr>
-          <w:lang w:eastAsia="ja-JP"/>
-        </w:rPr>
-      </w:pPr>
-      <w:r>
-        <w:rPr>
-          <w:rFonts w:hint="eastAsia"/>
-          <w:lang w:eastAsia="ja-JP"/>
-        </w:rPr>
         <w:t>埋め込み未実行・クラスタリング未実行・</w:t>
       </w:r>
       <w:r>
@@ -3086,15 +3085,7 @@
           <w:rFonts w:hint="eastAsia"/>
           <w:lang w:eastAsia="ja-JP"/>
         </w:rPr>
-        <w:t>埋め込み・クラスタリング状態は保存済み</w:t>
-      </w:r>
-      <w:r>
-        <w:rPr>
-          <w:rFonts w:hint="eastAsia"/>
-          <w:lang w:eastAsia="ja-JP"/>
-        </w:rPr>
-        <w:lastRenderedPageBreak/>
-        <w:t>リストで判定します</w:t>
+        <w:t>埋め込み・クラスタリング状態は保存済みリストで判定します</w:t>
       </w:r>
       <w:r>
         <w:rPr>
@@ -3337,6 +3328,7 @@
         <w:rPr>
           <w:lang w:eastAsia="ja-JP"/>
         </w:rPr>
+        <w:lastRenderedPageBreak/>
         <w:t xml:space="preserve"> </w:t>
       </w:r>
       <w:hyperlink r:id="rId21">
@@ -3358,10 +3350,14 @@
       <w:r>
         <w:rPr>
           <w:rFonts w:hint="eastAsia"/>
+          <w:lang w:eastAsia="ja-JP"/>
         </w:rPr>
         <w:t>レビュー依頼事項が記載されているので、よく読んで返信を書いてください。</w:t>
       </w:r>
       <w:r>
+        <w:rPr>
+          <w:lang w:eastAsia="ja-JP"/>
+        </w:rPr>
         <w:t xml:space="preserve"> </w:t>
       </w:r>
       <w:r>
@@ -3621,7 +3617,6 @@
         <w:rPr>
           <w:lang w:eastAsia="ja-JP"/>
         </w:rPr>
-        <w:lastRenderedPageBreak/>
         <w:t xml:space="preserve">P.25 </w:t>
       </w:r>
       <w:r>
@@ -3806,6 +3801,7 @@
         <w:rPr>
           <w:lang w:eastAsia="ja-JP"/>
         </w:rPr>
+        <w:lastRenderedPageBreak/>
         <w:t>ChatGPT</w:t>
       </w:r>
     </w:p>
@@ -4050,14 +4046,12 @@
         </w:rPr>
         <w:footnoteReference w:id="26"/>
       </w:r>
-      <w:proofErr w:type="spellStart"/>
       <w:r>
         <w:rPr>
           <w:rFonts w:hint="eastAsia"/>
         </w:rPr>
         <w:t>で決定</w:t>
       </w:r>
-      <w:proofErr w:type="spellEnd"/>
     </w:p>
     <w:p>
       <w:pPr>
@@ -4155,7 +4149,6 @@
         <w:pStyle w:val="FirstParagraph"/>
       </w:pPr>
       <w:r>
-        <w:lastRenderedPageBreak/>
         <w:t xml:space="preserve"> </w:t>
       </w:r>
       <w:hyperlink r:id="rId29">
@@ -4383,6 +4376,7 @@
         <w:rPr>
           <w:lang w:eastAsia="ja-JP"/>
         </w:rPr>
+        <w:lastRenderedPageBreak/>
         <w:t xml:space="preserve">P.29 </w:t>
       </w:r>
       <w:r>
@@ -4637,7 +4631,6 @@
           <w:rFonts w:hint="eastAsia"/>
           <w:lang w:eastAsia="ja-JP"/>
         </w:rPr>
-        <w:lastRenderedPageBreak/>
         <w:t>上級エンジニアから実装完了の報告が来ました。</w:t>
       </w:r>
       <w:r>
@@ -4823,7 +4816,7 @@
       <w:footnotePr>
         <w:numRestart w:val="eachSect"/>
       </w:footnotePr>
-      <w:pgSz w:w="12240" w:h="15840"/>
+      <w:pgSz w:w="11906" w:h="16838"/>
       <w:pgMar w:top="1440" w:right="1077" w:bottom="1440" w:left="1361" w:header="720" w:footer="720" w:gutter="0"/>
       <w:lnNumType w:countBy="1" w:restart="continuous"/>
       <w:cols w:space="720"/>
@@ -4902,7 +4895,7 @@
           <w:szCs w:val="21"/>
           <w:shd w:val="clear" w:color="auto" w:fill="FFFFFF"/>
         </w:rPr>
-        <w:t>Chief Technology Officer</w:t>
+        <w:t xml:space="preserve">Chief Technology Officer: </w:t>
       </w:r>
       <w:r>
         <w:rPr>
@@ -4912,20 +4905,8 @@
           <w:szCs w:val="21"/>
           <w:shd w:val="clear" w:color="auto" w:fill="FFFFFF"/>
         </w:rPr>
-        <w:t xml:space="preserve">: </w:t>
-      </w:r>
-      <w:proofErr w:type="spellStart"/>
-      <w:r>
-        <w:rPr>
-          <w:rFonts w:ascii="Arial" w:hAnsi="Arial" w:cs="Arial"/>
-          <w:color w:val="474747"/>
-          <w:sz w:val="21"/>
-          <w:szCs w:val="21"/>
-          <w:shd w:val="clear" w:color="auto" w:fill="FFFFFF"/>
-        </w:rPr>
         <w:t>最高技術責任者</w:t>
       </w:r>
-      <w:proofErr w:type="spellEnd"/>
     </w:p>
   </w:footnote>
   <w:footnote w:id="2">
@@ -4933,7 +4914,6 @@
       <w:pPr>
         <w:pStyle w:val="ab"/>
         <w:rPr>
-          <w:rFonts w:hint="eastAsia"/>
           <w:lang w:eastAsia="ja-JP"/>
         </w:rPr>
       </w:pPr>
@@ -4960,7 +4940,6 @@
       <w:pPr>
         <w:pStyle w:val="ab"/>
         <w:rPr>
-          <w:rFonts w:hint="eastAsia"/>
           <w:lang w:eastAsia="ja-JP"/>
         </w:rPr>
       </w:pPr>
@@ -5009,7 +4988,6 @@
       <w:pPr>
         <w:pStyle w:val="ab"/>
         <w:rPr>
-          <w:rFonts w:hint="eastAsia"/>
           <w:lang w:eastAsia="ja-JP"/>
         </w:rPr>
       </w:pPr>
@@ -5084,7 +5062,6 @@
       <w:pPr>
         <w:pStyle w:val="ab"/>
         <w:rPr>
-          <w:rFonts w:hint="eastAsia"/>
           <w:lang w:eastAsia="ja-JP"/>
         </w:rPr>
       </w:pPr>
@@ -5160,14 +5137,12 @@
         </w:rPr>
         <w:t>、</w:t>
       </w:r>
-      <w:proofErr w:type="spellStart"/>
       <w:r>
         <w:rPr>
           <w:lang w:eastAsia="ja-JP"/>
         </w:rPr>
         <w:t>visionOS</w:t>
       </w:r>
-      <w:proofErr w:type="spellEnd"/>
       <w:r>
         <w:rPr>
           <w:lang w:eastAsia="ja-JP"/>
@@ -5200,7 +5175,6 @@
       <w:pPr>
         <w:pStyle w:val="ab"/>
         <w:rPr>
-          <w:rFonts w:hint="eastAsia"/>
           <w:lang w:eastAsia="ja-JP"/>
         </w:rPr>
       </w:pPr>
@@ -5242,14 +5216,7 @@
           <w:rFonts w:hint="eastAsia"/>
           <w:lang w:eastAsia="ja-JP"/>
         </w:rPr>
-        <w:t>年に発表したプログラミング言語</w:t>
-      </w:r>
-      <w:r>
-        <w:rPr>
-          <w:rFonts w:hint="eastAsia"/>
-          <w:lang w:eastAsia="ja-JP"/>
-        </w:rPr>
-        <w:t>で、</w:t>
+        <w:t>年に発表したプログラミング言語で、</w:t>
       </w:r>
       <w:r>
         <w:rPr>
@@ -5319,14 +5286,7 @@
           <w:rFonts w:hint="eastAsia"/>
           <w:lang w:eastAsia="ja-JP"/>
         </w:rPr>
-        <w:t>製品向けのアプリを開発するために作られたが、現在はオープンソース化されており、サーバーサイド開発など幅広い用途で使われて</w:t>
-      </w:r>
-      <w:r>
-        <w:rPr>
-          <w:rFonts w:hint="eastAsia"/>
-          <w:lang w:eastAsia="ja-JP"/>
-        </w:rPr>
-        <w:t>いる。</w:t>
+        <w:t>製品向けのアプリを開発するために作られたが、現在はオープンソース化されており、サーバーサイド開発など幅広い用途で使われている。</w:t>
       </w:r>
     </w:p>
   </w:footnote>
@@ -5335,7 +5295,6 @@
       <w:pPr>
         <w:pStyle w:val="ab"/>
         <w:rPr>
-          <w:rFonts w:hint="eastAsia"/>
           <w:lang w:eastAsia="ja-JP"/>
         </w:rPr>
       </w:pPr>
@@ -5378,7 +5337,6 @@
       <w:pPr>
         <w:pStyle w:val="ab"/>
         <w:rPr>
-          <w:rFonts w:hint="eastAsia"/>
           <w:lang w:eastAsia="ja-JP"/>
         </w:rPr>
       </w:pPr>
@@ -5513,7 +5471,6 @@
       <w:pPr>
         <w:pStyle w:val="ab"/>
         <w:rPr>
-          <w:rFonts w:hint="eastAsia"/>
           <w:lang w:eastAsia="ja-JP"/>
         </w:rPr>
       </w:pPr>
@@ -5542,14 +5499,7 @@
           <w:rFonts w:hint="eastAsia"/>
           <w:lang w:eastAsia="ja-JP"/>
         </w:rPr>
-        <w:t>）</w:t>
-      </w:r>
-      <w:r>
-        <w:rPr>
-          <w:rFonts w:hint="eastAsia"/>
-          <w:lang w:eastAsia="ja-JP"/>
-        </w:rPr>
-        <w:t>。</w:t>
+        <w:t>）。</w:t>
       </w:r>
       <w:r>
         <w:rPr>
@@ -5563,28 +5513,7 @@
           <w:rFonts w:hint="eastAsia"/>
           <w:lang w:eastAsia="ja-JP"/>
         </w:rPr>
-        <w:t>プラットフォームの開発</w:t>
-      </w:r>
-      <w:r>
-        <w:rPr>
-          <w:rFonts w:hint="eastAsia"/>
-          <w:lang w:eastAsia="ja-JP"/>
-        </w:rPr>
-        <w:t>で</w:t>
-      </w:r>
-      <w:r>
-        <w:rPr>
-          <w:rFonts w:hint="eastAsia"/>
-          <w:lang w:eastAsia="ja-JP"/>
-        </w:rPr>
-        <w:t>は、デバイス内のローカルデータ保存に欠かせない重要な役割を担</w:t>
-      </w:r>
-      <w:r>
-        <w:rPr>
-          <w:rFonts w:hint="eastAsia"/>
-          <w:lang w:eastAsia="ja-JP"/>
-        </w:rPr>
-        <w:t>う。</w:t>
+        <w:t>プラットフォームの開発では、デバイス内のローカルデータ保存に欠かせない重要な役割を担う。</w:t>
       </w:r>
     </w:p>
   </w:footnote>
@@ -5593,7 +5522,6 @@
       <w:pPr>
         <w:pStyle w:val="ab"/>
         <w:rPr>
-          <w:rFonts w:hint="eastAsia"/>
           <w:lang w:eastAsia="ja-JP"/>
         </w:rPr>
       </w:pPr>
@@ -5628,21 +5556,7 @@
           <w:rFonts w:hint="eastAsia"/>
           <w:lang w:eastAsia="ja-JP"/>
         </w:rPr>
-        <w:t>を公式化した</w:t>
-      </w:r>
-      <w:r>
-        <w:rPr>
-          <w:rFonts w:hint="eastAsia"/>
-          <w:lang w:eastAsia="ja-JP"/>
-        </w:rPr>
-        <w:t>仕様</w:t>
-      </w:r>
-      <w:r>
-        <w:rPr>
-          <w:rFonts w:hint="eastAsia"/>
-          <w:lang w:eastAsia="ja-JP"/>
-        </w:rPr>
-        <w:t>（</w:t>
+        <w:t>を公式化した仕様（</w:t>
       </w:r>
       <w:r>
         <w:rPr>
@@ -5679,7 +5593,6 @@
       <w:pPr>
         <w:pStyle w:val="ab"/>
         <w:rPr>
-          <w:rFonts w:hint="eastAsia"/>
           <w:lang w:eastAsia="ja-JP"/>
         </w:rPr>
       </w:pPr>
@@ -5712,28 +5625,7 @@
           <w:rFonts w:hint="eastAsia"/>
           <w:lang w:eastAsia="ja-JP"/>
         </w:rPr>
-        <w:t>のこと。</w:t>
-      </w:r>
-      <w:r>
-        <w:rPr>
-          <w:rFonts w:hint="eastAsia"/>
-          <w:lang w:eastAsia="ja-JP"/>
-        </w:rPr>
-        <w:t>テキストファイルの先頭に付与され</w:t>
-      </w:r>
-      <w:r>
-        <w:rPr>
-          <w:rFonts w:hint="eastAsia"/>
-          <w:lang w:eastAsia="ja-JP"/>
-        </w:rPr>
-        <w:t>る符号。</w:t>
-      </w:r>
-      <w:r>
-        <w:rPr>
-          <w:rFonts w:hint="eastAsia"/>
-          <w:lang w:eastAsia="ja-JP"/>
-        </w:rPr>
-        <w:t>「そのファイルがどの文字コード（</w:t>
+        <w:t>のこと。テキストファイルの先頭に付与される符号。「そのファイルがどの文字コード（</w:t>
       </w:r>
       <w:r>
         <w:rPr>
@@ -5747,14 +5639,7 @@
           <w:rFonts w:hint="eastAsia"/>
           <w:lang w:eastAsia="ja-JP"/>
         </w:rPr>
-        <w:t>）で書かれているか」をプログラムやアプリに</w:t>
-      </w:r>
-      <w:r>
-        <w:rPr>
-          <w:rFonts w:hint="eastAsia"/>
-          <w:lang w:eastAsia="ja-JP"/>
-        </w:rPr>
-        <w:t>伝える。</w:t>
+        <w:t>）で書かれているか」をプログラムやアプリに伝える。</w:t>
       </w:r>
     </w:p>
   </w:footnote>
@@ -5763,7 +5648,6 @@
       <w:pPr>
         <w:pStyle w:val="ab"/>
         <w:rPr>
-          <w:rFonts w:hint="eastAsia"/>
           <w:lang w:eastAsia="ja-JP"/>
         </w:rPr>
       </w:pPr>
@@ -5822,7 +5706,6 @@
       <w:pPr>
         <w:pStyle w:val="ab"/>
         <w:rPr>
-          <w:rFonts w:hint="eastAsia"/>
           <w:lang w:eastAsia="ja-JP"/>
         </w:rPr>
       </w:pPr>
@@ -5858,7 +5741,6 @@
       <w:pPr>
         <w:pStyle w:val="ab"/>
         <w:rPr>
-          <w:rFonts w:hint="eastAsia"/>
           <w:lang w:eastAsia="ja-JP"/>
         </w:rPr>
       </w:pPr>
@@ -5907,7 +5789,6 @@
       <w:pPr>
         <w:pStyle w:val="ab"/>
         <w:rPr>
-          <w:rFonts w:hint="eastAsia"/>
           <w:lang w:eastAsia="ja-JP"/>
         </w:rPr>
       </w:pPr>
@@ -5966,14 +5847,7 @@
           <w:rFonts w:hint="eastAsia"/>
           <w:lang w:eastAsia="ja-JP"/>
         </w:rPr>
-        <w:t>手法</w:t>
-      </w:r>
-      <w:r>
-        <w:rPr>
-          <w:rFonts w:hint="eastAsia"/>
-          <w:lang w:eastAsia="ja-JP"/>
-        </w:rPr>
-        <w:t>として「</w:t>
+        <w:t>手法として「</w:t>
       </w:r>
       <w:r>
         <w:rPr>
@@ -6048,7 +5922,6 @@
       <w:pPr>
         <w:pStyle w:val="ab"/>
         <w:rPr>
-          <w:rFonts w:hint="eastAsia"/>
           <w:lang w:eastAsia="ja-JP"/>
         </w:rPr>
       </w:pPr>
@@ -6097,7 +5970,6 @@
       <w:pPr>
         <w:pStyle w:val="ab"/>
         <w:rPr>
-          <w:rFonts w:hint="eastAsia"/>
           <w:lang w:eastAsia="ja-JP"/>
         </w:rPr>
       </w:pPr>
@@ -6124,7 +5996,6 @@
       <w:pPr>
         <w:pStyle w:val="ab"/>
         <w:rPr>
-          <w:rFonts w:hint="eastAsia"/>
           <w:lang w:eastAsia="ja-JP"/>
         </w:rPr>
       </w:pPr>
@@ -6166,7 +6037,6 @@
       <w:pPr>
         <w:pStyle w:val="ab"/>
         <w:rPr>
-          <w:rFonts w:hint="eastAsia"/>
           <w:lang w:eastAsia="ja-JP"/>
         </w:rPr>
       </w:pPr>
@@ -6268,7 +6138,6 @@
       <w:pPr>
         <w:pStyle w:val="ab"/>
         <w:rPr>
-          <w:rFonts w:hint="eastAsia"/>
           <w:lang w:eastAsia="ja-JP"/>
         </w:rPr>
       </w:pPr>
@@ -6305,7 +6174,6 @@
       <w:pPr>
         <w:pStyle w:val="ab"/>
         <w:rPr>
-          <w:rFonts w:hint="eastAsia"/>
           <w:lang w:eastAsia="ja-JP"/>
         </w:rPr>
       </w:pPr>
@@ -6369,7 +6237,6 @@
       <w:pPr>
         <w:pStyle w:val="ab"/>
         <w:rPr>
-          <w:rFonts w:hint="eastAsia"/>
           <w:lang w:eastAsia="ja-JP"/>
         </w:rPr>
       </w:pPr>
@@ -6465,7 +6332,6 @@
       <w:pPr>
         <w:pStyle w:val="ab"/>
         <w:rPr>
-          <w:rFonts w:hint="eastAsia"/>
           <w:lang w:eastAsia="ja-JP"/>
         </w:rPr>
       </w:pPr>
@@ -6532,7 +6398,6 @@
       <w:pPr>
         <w:pStyle w:val="ab"/>
         <w:rPr>
-          <w:rFonts w:hint="eastAsia"/>
           <w:lang w:eastAsia="ja-JP"/>
         </w:rPr>
       </w:pPr>
@@ -6598,7 +6463,6 @@
       <w:pPr>
         <w:pStyle w:val="ab"/>
         <w:rPr>
-          <w:rFonts w:hint="eastAsia"/>
           <w:lang w:eastAsia="ja-JP"/>
         </w:rPr>
       </w:pPr>
@@ -6632,7 +6496,6 @@
       <w:pPr>
         <w:pStyle w:val="ab"/>
         <w:rPr>
-          <w:rFonts w:hint="eastAsia"/>
           <w:lang w:eastAsia="ja-JP"/>
         </w:rPr>
       </w:pPr>
@@ -6671,14 +6534,7 @@
           <w:rFonts w:hint="eastAsia"/>
           <w:lang w:eastAsia="ja-JP"/>
         </w:rPr>
-        <w:t>モデル。</w:t>
-      </w:r>
-      <w:r>
-        <w:rPr>
-          <w:rFonts w:hint="eastAsia"/>
-          <w:lang w:eastAsia="ja-JP"/>
-        </w:rPr>
-        <w:t>推論なしで安価。</w:t>
+        <w:t>モデル。推論なしで安価。</w:t>
       </w:r>
     </w:p>
   </w:footnote>

</xml_diff>